<commit_message>
ajustes nas classes de controle de venda e de pesquisa de produtos para vendas de mode que reflitam cada armazem onde o produto for vendido
</commit_message>
<xml_diff>
--- a/Documentacao_Projeto_JM-InvSM.docx
+++ b/Documentacao_Projeto_JM-InvSM.docx
@@ -174,19 +174,6 @@
         </w:rPr>
         <w:t>16 DE AGOSTO DE 2024</w:t>
       </w:r>
-    </w:p>
-    <w:p>
-      <w:pPr>
-        <w:spacing w:line="360" w:lineRule="auto"/>
-        <w:rPr>
-          <w:rFonts w:ascii="Times New Roman" w:hAnsi="Times New Roman" w:cs="Times New Roman"/>
-          <w:b/>
-          <w:bCs/>
-          <w:sz w:val="36"/>
-          <w:szCs w:val="36"/>
-          <w:lang w:val="pt-PT"/>
-        </w:rPr>
-      </w:pPr>
       <w:r>
         <w:rPr>
           <w:rFonts w:ascii="Times New Roman" w:hAnsi="Times New Roman" w:cs="Times New Roman"/>
@@ -1012,6 +999,14 @@
                 <w:webHidden/>
                 <w:lang w:val="pt-PT"/>
               </w:rPr>
+            </w:r>
+            <w:r>
+              <w:rPr>
+                <w:rFonts w:ascii="Times New Roman" w:hAnsi="Times New Roman" w:cs="Times New Roman"/>
+                <w:noProof/>
+                <w:webHidden/>
+                <w:lang w:val="pt-PT"/>
+              </w:rPr>
               <w:fldChar w:fldCharType="separate"/>
             </w:r>
             <w:r>
@@ -1092,6 +1087,14 @@
                 <w:webHidden/>
                 <w:lang w:val="pt-PT"/>
               </w:rPr>
+            </w:r>
+            <w:r>
+              <w:rPr>
+                <w:rFonts w:ascii="Times New Roman" w:hAnsi="Times New Roman" w:cs="Times New Roman"/>
+                <w:noProof/>
+                <w:webHidden/>
+                <w:lang w:val="pt-PT"/>
+              </w:rPr>
               <w:fldChar w:fldCharType="separate"/>
             </w:r>
             <w:r>
@@ -1172,6 +1175,14 @@
                 <w:webHidden/>
                 <w:lang w:val="pt-PT"/>
               </w:rPr>
+            </w:r>
+            <w:r>
+              <w:rPr>
+                <w:rFonts w:ascii="Times New Roman" w:hAnsi="Times New Roman" w:cs="Times New Roman"/>
+                <w:noProof/>
+                <w:webHidden/>
+                <w:lang w:val="pt-PT"/>
+              </w:rPr>
               <w:fldChar w:fldCharType="separate"/>
             </w:r>
             <w:r>
@@ -1252,6 +1263,14 @@
                 <w:webHidden/>
                 <w:lang w:val="pt-PT"/>
               </w:rPr>
+            </w:r>
+            <w:r>
+              <w:rPr>
+                <w:rFonts w:ascii="Times New Roman" w:hAnsi="Times New Roman" w:cs="Times New Roman"/>
+                <w:noProof/>
+                <w:webHidden/>
+                <w:lang w:val="pt-PT"/>
+              </w:rPr>
               <w:fldChar w:fldCharType="separate"/>
             </w:r>
             <w:r>
@@ -1332,6 +1351,14 @@
                 <w:webHidden/>
                 <w:lang w:val="pt-PT"/>
               </w:rPr>
+            </w:r>
+            <w:r>
+              <w:rPr>
+                <w:rFonts w:ascii="Times New Roman" w:hAnsi="Times New Roman" w:cs="Times New Roman"/>
+                <w:noProof/>
+                <w:webHidden/>
+                <w:lang w:val="pt-PT"/>
+              </w:rPr>
               <w:fldChar w:fldCharType="separate"/>
             </w:r>
             <w:r>
@@ -1412,6 +1439,14 @@
                 <w:webHidden/>
                 <w:lang w:val="pt-PT"/>
               </w:rPr>
+            </w:r>
+            <w:r>
+              <w:rPr>
+                <w:rFonts w:ascii="Times New Roman" w:hAnsi="Times New Roman" w:cs="Times New Roman"/>
+                <w:noProof/>
+                <w:webHidden/>
+                <w:lang w:val="pt-PT"/>
+              </w:rPr>
               <w:fldChar w:fldCharType="separate"/>
             </w:r>
             <w:r>
@@ -1492,6 +1527,14 @@
                 <w:webHidden/>
                 <w:lang w:val="pt-PT"/>
               </w:rPr>
+            </w:r>
+            <w:r>
+              <w:rPr>
+                <w:rFonts w:ascii="Times New Roman" w:hAnsi="Times New Roman" w:cs="Times New Roman"/>
+                <w:noProof/>
+                <w:webHidden/>
+                <w:lang w:val="pt-PT"/>
+              </w:rPr>
               <w:fldChar w:fldCharType="separate"/>
             </w:r>
             <w:r>
@@ -1572,6 +1615,14 @@
                 <w:webHidden/>
                 <w:lang w:val="pt-PT"/>
               </w:rPr>
+            </w:r>
+            <w:r>
+              <w:rPr>
+                <w:rFonts w:ascii="Times New Roman" w:hAnsi="Times New Roman" w:cs="Times New Roman"/>
+                <w:noProof/>
+                <w:webHidden/>
+                <w:lang w:val="pt-PT"/>
+              </w:rPr>
               <w:fldChar w:fldCharType="separate"/>
             </w:r>
             <w:r>
@@ -1652,6 +1703,14 @@
                 <w:webHidden/>
                 <w:lang w:val="pt-PT"/>
               </w:rPr>
+            </w:r>
+            <w:r>
+              <w:rPr>
+                <w:rFonts w:ascii="Times New Roman" w:hAnsi="Times New Roman" w:cs="Times New Roman"/>
+                <w:noProof/>
+                <w:webHidden/>
+                <w:lang w:val="pt-PT"/>
+              </w:rPr>
               <w:fldChar w:fldCharType="separate"/>
             </w:r>
             <w:r>
@@ -1732,6 +1791,14 @@
                 <w:webHidden/>
                 <w:lang w:val="pt-PT"/>
               </w:rPr>
+            </w:r>
+            <w:r>
+              <w:rPr>
+                <w:rFonts w:ascii="Times New Roman" w:hAnsi="Times New Roman" w:cs="Times New Roman"/>
+                <w:noProof/>
+                <w:webHidden/>
+                <w:lang w:val="pt-PT"/>
+              </w:rPr>
               <w:fldChar w:fldCharType="separate"/>
             </w:r>
             <w:r>
@@ -1812,6 +1879,14 @@
                 <w:webHidden/>
                 <w:lang w:val="pt-PT"/>
               </w:rPr>
+            </w:r>
+            <w:r>
+              <w:rPr>
+                <w:rFonts w:ascii="Times New Roman" w:hAnsi="Times New Roman" w:cs="Times New Roman"/>
+                <w:noProof/>
+                <w:webHidden/>
+                <w:lang w:val="pt-PT"/>
+              </w:rPr>
               <w:fldChar w:fldCharType="separate"/>
             </w:r>
             <w:r>
@@ -1892,6 +1967,14 @@
                 <w:webHidden/>
                 <w:lang w:val="pt-PT"/>
               </w:rPr>
+            </w:r>
+            <w:r>
+              <w:rPr>
+                <w:rFonts w:ascii="Times New Roman" w:hAnsi="Times New Roman" w:cs="Times New Roman"/>
+                <w:noProof/>
+                <w:webHidden/>
+                <w:lang w:val="pt-PT"/>
+              </w:rPr>
               <w:fldChar w:fldCharType="separate"/>
             </w:r>
             <w:r>
@@ -1972,6 +2055,14 @@
                 <w:webHidden/>
                 <w:lang w:val="pt-PT"/>
               </w:rPr>
+            </w:r>
+            <w:r>
+              <w:rPr>
+                <w:rFonts w:ascii="Times New Roman" w:hAnsi="Times New Roman" w:cs="Times New Roman"/>
+                <w:noProof/>
+                <w:webHidden/>
+                <w:lang w:val="pt-PT"/>
+              </w:rPr>
               <w:fldChar w:fldCharType="separate"/>
             </w:r>
             <w:r>
@@ -2052,6 +2143,14 @@
                 <w:webHidden/>
                 <w:lang w:val="pt-PT"/>
               </w:rPr>
+            </w:r>
+            <w:r>
+              <w:rPr>
+                <w:rFonts w:ascii="Times New Roman" w:hAnsi="Times New Roman" w:cs="Times New Roman"/>
+                <w:noProof/>
+                <w:webHidden/>
+                <w:lang w:val="pt-PT"/>
+              </w:rPr>
               <w:fldChar w:fldCharType="separate"/>
             </w:r>
             <w:r>
@@ -2132,6 +2231,14 @@
                 <w:webHidden/>
                 <w:lang w:val="pt-PT"/>
               </w:rPr>
+            </w:r>
+            <w:r>
+              <w:rPr>
+                <w:rFonts w:ascii="Times New Roman" w:hAnsi="Times New Roman" w:cs="Times New Roman"/>
+                <w:noProof/>
+                <w:webHidden/>
+                <w:lang w:val="pt-PT"/>
+              </w:rPr>
               <w:fldChar w:fldCharType="separate"/>
             </w:r>
             <w:r>
@@ -2212,6 +2319,14 @@
                 <w:webHidden/>
                 <w:lang w:val="pt-PT"/>
               </w:rPr>
+            </w:r>
+            <w:r>
+              <w:rPr>
+                <w:rFonts w:ascii="Times New Roman" w:hAnsi="Times New Roman" w:cs="Times New Roman"/>
+                <w:noProof/>
+                <w:webHidden/>
+                <w:lang w:val="pt-PT"/>
+              </w:rPr>
               <w:fldChar w:fldCharType="separate"/>
             </w:r>
             <w:r>
@@ -2292,6 +2407,14 @@
                 <w:webHidden/>
                 <w:lang w:val="pt-PT"/>
               </w:rPr>
+            </w:r>
+            <w:r>
+              <w:rPr>
+                <w:rFonts w:ascii="Times New Roman" w:hAnsi="Times New Roman" w:cs="Times New Roman"/>
+                <w:noProof/>
+                <w:webHidden/>
+                <w:lang w:val="pt-PT"/>
+              </w:rPr>
               <w:fldChar w:fldCharType="separate"/>
             </w:r>
             <w:r>
@@ -2372,6 +2495,14 @@
                 <w:webHidden/>
                 <w:lang w:val="pt-PT"/>
               </w:rPr>
+            </w:r>
+            <w:r>
+              <w:rPr>
+                <w:rFonts w:ascii="Times New Roman" w:hAnsi="Times New Roman" w:cs="Times New Roman"/>
+                <w:noProof/>
+                <w:webHidden/>
+                <w:lang w:val="pt-PT"/>
+              </w:rPr>
               <w:fldChar w:fldCharType="separate"/>
             </w:r>
             <w:r>
@@ -2452,6 +2583,14 @@
                 <w:webHidden/>
                 <w:lang w:val="pt-PT"/>
               </w:rPr>
+            </w:r>
+            <w:r>
+              <w:rPr>
+                <w:rFonts w:ascii="Times New Roman" w:hAnsi="Times New Roman" w:cs="Times New Roman"/>
+                <w:noProof/>
+                <w:webHidden/>
+                <w:lang w:val="pt-PT"/>
+              </w:rPr>
               <w:fldChar w:fldCharType="separate"/>
             </w:r>
             <w:r>
@@ -2532,6 +2671,14 @@
                 <w:webHidden/>
                 <w:lang w:val="pt-PT"/>
               </w:rPr>
+            </w:r>
+            <w:r>
+              <w:rPr>
+                <w:rFonts w:ascii="Times New Roman" w:hAnsi="Times New Roman" w:cs="Times New Roman"/>
+                <w:noProof/>
+                <w:webHidden/>
+                <w:lang w:val="pt-PT"/>
+              </w:rPr>
               <w:fldChar w:fldCharType="separate"/>
             </w:r>
             <w:r>
@@ -2612,6 +2759,14 @@
                 <w:webHidden/>
                 <w:lang w:val="pt-PT"/>
               </w:rPr>
+            </w:r>
+            <w:r>
+              <w:rPr>
+                <w:rFonts w:ascii="Times New Roman" w:hAnsi="Times New Roman" w:cs="Times New Roman"/>
+                <w:noProof/>
+                <w:webHidden/>
+                <w:lang w:val="pt-PT"/>
+              </w:rPr>
               <w:fldChar w:fldCharType="separate"/>
             </w:r>
             <w:r>
@@ -2692,6 +2847,14 @@
                 <w:webHidden/>
                 <w:lang w:val="pt-PT"/>
               </w:rPr>
+            </w:r>
+            <w:r>
+              <w:rPr>
+                <w:rFonts w:ascii="Times New Roman" w:hAnsi="Times New Roman" w:cs="Times New Roman"/>
+                <w:noProof/>
+                <w:webHidden/>
+                <w:lang w:val="pt-PT"/>
+              </w:rPr>
               <w:fldChar w:fldCharType="separate"/>
             </w:r>
             <w:r>
@@ -2772,6 +2935,14 @@
                 <w:webHidden/>
                 <w:lang w:val="pt-PT"/>
               </w:rPr>
+            </w:r>
+            <w:r>
+              <w:rPr>
+                <w:rFonts w:ascii="Times New Roman" w:hAnsi="Times New Roman" w:cs="Times New Roman"/>
+                <w:noProof/>
+                <w:webHidden/>
+                <w:lang w:val="pt-PT"/>
+              </w:rPr>
               <w:fldChar w:fldCharType="separate"/>
             </w:r>
             <w:r>
@@ -2844,6 +3015,14 @@
                 <w:lang w:val="pt-PT"/>
               </w:rPr>
               <w:instrText xml:space="preserve"> PAGEREF _Toc205618851 \h </w:instrText>
+            </w:r>
+            <w:r>
+              <w:rPr>
+                <w:rFonts w:ascii="Times New Roman" w:hAnsi="Times New Roman" w:cs="Times New Roman"/>
+                <w:noProof/>
+                <w:webHidden/>
+                <w:lang w:val="pt-PT"/>
+              </w:rPr>
             </w:r>
             <w:r>
               <w:rPr>
@@ -4145,7 +4324,6 @@
                 <w:lang w:val="pt-PT"/>
               </w:rPr>
             </w:pPr>
-            <w:proofErr w:type="spellStart"/>
             <w:r>
               <w:rPr>
                 <w:rFonts w:ascii="Times New Roman" w:hAnsi="Times New Roman" w:cs="Times New Roman"/>
@@ -4162,86 +4340,13 @@
               </w:rPr>
               <w:t>r</w:t>
             </w:r>
-            <w:proofErr w:type="spellEnd"/>
             <w:r>
               <w:rPr>
                 <w:rFonts w:ascii="Times New Roman" w:hAnsi="Times New Roman" w:cs="Times New Roman"/>
                 <w:sz w:val="20"/>
                 <w:szCs w:val="20"/>
               </w:rPr>
-              <w:t xml:space="preserve"> </w:t>
-            </w:r>
-            <w:proofErr w:type="spellStart"/>
-            <w:r>
-              <w:rPr>
-                <w:rFonts w:ascii="Times New Roman" w:hAnsi="Times New Roman" w:cs="Times New Roman"/>
-                <w:sz w:val="20"/>
-                <w:szCs w:val="20"/>
-              </w:rPr>
-              <w:t>informações</w:t>
-            </w:r>
-            <w:proofErr w:type="spellEnd"/>
-            <w:r>
-              <w:rPr>
-                <w:rFonts w:ascii="Times New Roman" w:hAnsi="Times New Roman" w:cs="Times New Roman"/>
-                <w:sz w:val="20"/>
-                <w:szCs w:val="20"/>
-              </w:rPr>
-              <w:t xml:space="preserve"> </w:t>
-            </w:r>
-            <w:proofErr w:type="spellStart"/>
-            <w:r>
-              <w:rPr>
-                <w:rFonts w:ascii="Times New Roman" w:hAnsi="Times New Roman" w:cs="Times New Roman"/>
-                <w:sz w:val="20"/>
-                <w:szCs w:val="20"/>
-              </w:rPr>
-              <w:t>sobre</w:t>
-            </w:r>
-            <w:proofErr w:type="spellEnd"/>
-            <w:r>
-              <w:rPr>
-                <w:rFonts w:ascii="Times New Roman" w:hAnsi="Times New Roman" w:cs="Times New Roman"/>
-                <w:sz w:val="20"/>
-                <w:szCs w:val="20"/>
-              </w:rPr>
-              <w:t xml:space="preserve"> </w:t>
-            </w:r>
-            <w:proofErr w:type="spellStart"/>
-            <w:r>
-              <w:rPr>
-                <w:rFonts w:ascii="Times New Roman" w:hAnsi="Times New Roman" w:cs="Times New Roman"/>
-                <w:sz w:val="20"/>
-                <w:szCs w:val="20"/>
-              </w:rPr>
-              <w:t>estrutura</w:t>
-            </w:r>
-            <w:proofErr w:type="spellEnd"/>
-            <w:r>
-              <w:rPr>
-                <w:rFonts w:ascii="Times New Roman" w:hAnsi="Times New Roman" w:cs="Times New Roman"/>
-                <w:sz w:val="20"/>
-                <w:szCs w:val="20"/>
-              </w:rPr>
-              <w:t xml:space="preserve">, </w:t>
-            </w:r>
-            <w:proofErr w:type="spellStart"/>
-            <w:r>
-              <w:rPr>
-                <w:rFonts w:ascii="Times New Roman" w:hAnsi="Times New Roman" w:cs="Times New Roman"/>
-                <w:sz w:val="20"/>
-                <w:szCs w:val="20"/>
-              </w:rPr>
-              <w:t>índices</w:t>
-            </w:r>
-            <w:proofErr w:type="spellEnd"/>
-            <w:r>
-              <w:rPr>
-                <w:rFonts w:ascii="Times New Roman" w:hAnsi="Times New Roman" w:cs="Times New Roman"/>
-                <w:sz w:val="20"/>
-                <w:szCs w:val="20"/>
-              </w:rPr>
-              <w:t xml:space="preserve"> e performance</w:t>
+              <w:t xml:space="preserve"> informações sobre estrutura, índices e performance</w:t>
             </w:r>
           </w:p>
         </w:tc>
@@ -4589,70 +4694,14 @@
                 <w:lang w:val="pt-PT"/>
               </w:rPr>
             </w:pPr>
-            <w:proofErr w:type="spellStart"/>
             <w:r>
               <w:rPr>
                 <w:rFonts w:ascii="Times New Roman" w:hAnsi="Times New Roman" w:cs="Times New Roman"/>
                 <w:sz w:val="20"/>
                 <w:szCs w:val="20"/>
               </w:rPr>
-              <w:t>Explica</w:t>
-            </w:r>
-            <w:proofErr w:type="spellEnd"/>
-            <w:r>
-              <w:rPr>
-                <w:rFonts w:ascii="Times New Roman" w:hAnsi="Times New Roman" w:cs="Times New Roman"/>
-                <w:sz w:val="20"/>
-                <w:szCs w:val="20"/>
-              </w:rPr>
-              <w:t xml:space="preserve"> </w:t>
-            </w:r>
-            <w:proofErr w:type="spellStart"/>
-            <w:r>
-              <w:rPr>
-                <w:rFonts w:ascii="Times New Roman" w:hAnsi="Times New Roman" w:cs="Times New Roman"/>
-                <w:sz w:val="20"/>
-                <w:szCs w:val="20"/>
-              </w:rPr>
-              <w:t>relatórios</w:t>
-            </w:r>
-            <w:proofErr w:type="spellEnd"/>
-            <w:r>
-              <w:rPr>
-                <w:rFonts w:ascii="Times New Roman" w:hAnsi="Times New Roman" w:cs="Times New Roman"/>
-                <w:sz w:val="20"/>
-                <w:szCs w:val="20"/>
-              </w:rPr>
-              <w:t xml:space="preserve"> e </w:t>
-            </w:r>
-            <w:proofErr w:type="spellStart"/>
-            <w:r>
-              <w:rPr>
-                <w:rFonts w:ascii="Times New Roman" w:hAnsi="Times New Roman" w:cs="Times New Roman"/>
-                <w:sz w:val="20"/>
-                <w:szCs w:val="20"/>
-              </w:rPr>
-              <w:t>interpreta</w:t>
-            </w:r>
-            <w:proofErr w:type="spellEnd"/>
-            <w:r>
-              <w:rPr>
-                <w:rFonts w:ascii="Times New Roman" w:hAnsi="Times New Roman" w:cs="Times New Roman"/>
-                <w:sz w:val="20"/>
-                <w:szCs w:val="20"/>
-              </w:rPr>
-              <w:t xml:space="preserve"> dados de </w:t>
-            </w:r>
-            <w:proofErr w:type="spellStart"/>
-            <w:r>
-              <w:rPr>
-                <w:rFonts w:ascii="Times New Roman" w:hAnsi="Times New Roman" w:cs="Times New Roman"/>
-                <w:sz w:val="20"/>
-                <w:szCs w:val="20"/>
-              </w:rPr>
-              <w:t>faturas</w:t>
-            </w:r>
-            <w:proofErr w:type="spellEnd"/>
+              <w:t>Explica relatórios e interpreta dados de faturas</w:t>
+            </w:r>
           </w:p>
         </w:tc>
       </w:tr>
@@ -4759,54 +4808,8 @@
                 <w:sz w:val="20"/>
                 <w:szCs w:val="20"/>
               </w:rPr>
-              <w:t xml:space="preserve">Informa </w:t>
-            </w:r>
-            <w:proofErr w:type="spellStart"/>
-            <w:r>
-              <w:rPr>
-                <w:rFonts w:ascii="Times New Roman" w:hAnsi="Times New Roman" w:cs="Times New Roman"/>
-                <w:sz w:val="20"/>
-                <w:szCs w:val="20"/>
-              </w:rPr>
-              <w:t>origem</w:t>
-            </w:r>
-            <w:proofErr w:type="spellEnd"/>
-            <w:r>
-              <w:rPr>
-                <w:rFonts w:ascii="Times New Roman" w:hAnsi="Times New Roman" w:cs="Times New Roman"/>
-                <w:sz w:val="20"/>
-                <w:szCs w:val="20"/>
-              </w:rPr>
-              <w:t xml:space="preserve"> e </w:t>
-            </w:r>
-            <w:proofErr w:type="spellStart"/>
-            <w:r>
-              <w:rPr>
-                <w:rFonts w:ascii="Times New Roman" w:hAnsi="Times New Roman" w:cs="Times New Roman"/>
-                <w:sz w:val="20"/>
-                <w:szCs w:val="20"/>
-              </w:rPr>
-              <w:t>movimentação</w:t>
-            </w:r>
-            <w:proofErr w:type="spellEnd"/>
-            <w:r>
-              <w:rPr>
-                <w:rFonts w:ascii="Times New Roman" w:hAnsi="Times New Roman" w:cs="Times New Roman"/>
-                <w:sz w:val="20"/>
-                <w:szCs w:val="20"/>
-              </w:rPr>
-              <w:t xml:space="preserve"> de </w:t>
-            </w:r>
-            <w:proofErr w:type="spellStart"/>
-            <w:r>
-              <w:rPr>
-                <w:rFonts w:ascii="Times New Roman" w:hAnsi="Times New Roman" w:cs="Times New Roman"/>
-                <w:sz w:val="20"/>
-                <w:szCs w:val="20"/>
-              </w:rPr>
-              <w:t>produtos</w:t>
-            </w:r>
-            <w:proofErr w:type="spellEnd"/>
+              <w:t>Informa origem e movimentação de produtos</w:t>
+            </w:r>
           </w:p>
         </w:tc>
       </w:tr>
@@ -4904,70 +4907,14 @@
                 <w:lang w:val="pt-PT"/>
               </w:rPr>
             </w:pPr>
-            <w:proofErr w:type="spellStart"/>
             <w:r>
               <w:rPr>
                 <w:rFonts w:ascii="Times New Roman" w:hAnsi="Times New Roman" w:cs="Times New Roman"/>
                 <w:sz w:val="20"/>
                 <w:szCs w:val="20"/>
               </w:rPr>
-              <w:t>Explica</w:t>
-            </w:r>
-            <w:proofErr w:type="spellEnd"/>
-            <w:r>
-              <w:rPr>
-                <w:rFonts w:ascii="Times New Roman" w:hAnsi="Times New Roman" w:cs="Times New Roman"/>
-                <w:sz w:val="20"/>
-                <w:szCs w:val="20"/>
-              </w:rPr>
-              <w:t xml:space="preserve"> </w:t>
-            </w:r>
-            <w:proofErr w:type="spellStart"/>
-            <w:r>
-              <w:rPr>
-                <w:rFonts w:ascii="Times New Roman" w:hAnsi="Times New Roman" w:cs="Times New Roman"/>
-                <w:sz w:val="20"/>
-                <w:szCs w:val="20"/>
-              </w:rPr>
-              <w:t>lançamentos</w:t>
-            </w:r>
-            <w:proofErr w:type="spellEnd"/>
-            <w:r>
-              <w:rPr>
-                <w:rFonts w:ascii="Times New Roman" w:hAnsi="Times New Roman" w:cs="Times New Roman"/>
-                <w:sz w:val="20"/>
-                <w:szCs w:val="20"/>
-              </w:rPr>
-              <w:t xml:space="preserve"> </w:t>
-            </w:r>
-            <w:proofErr w:type="spellStart"/>
-            <w:r>
-              <w:rPr>
-                <w:rFonts w:ascii="Times New Roman" w:hAnsi="Times New Roman" w:cs="Times New Roman"/>
-                <w:sz w:val="20"/>
-                <w:szCs w:val="20"/>
-              </w:rPr>
-              <w:t>financeiros</w:t>
-            </w:r>
-            <w:proofErr w:type="spellEnd"/>
-            <w:r>
-              <w:rPr>
-                <w:rFonts w:ascii="Times New Roman" w:hAnsi="Times New Roman" w:cs="Times New Roman"/>
-                <w:sz w:val="20"/>
-                <w:szCs w:val="20"/>
-              </w:rPr>
-              <w:t xml:space="preserve"> e </w:t>
-            </w:r>
-            <w:proofErr w:type="spellStart"/>
-            <w:r>
-              <w:rPr>
-                <w:rFonts w:ascii="Times New Roman" w:hAnsi="Times New Roman" w:cs="Times New Roman"/>
-                <w:sz w:val="20"/>
-                <w:szCs w:val="20"/>
-              </w:rPr>
-              <w:t>reconciliação</w:t>
-            </w:r>
-            <w:proofErr w:type="spellEnd"/>
+              <w:t>Explica lançamentos financeiros e reconciliação</w:t>
+            </w:r>
           </w:p>
         </w:tc>
       </w:tr>
@@ -7590,7 +7537,6 @@
           <w:lang w:val="pt-PT"/>
         </w:rPr>
       </w:pPr>
-      <w:proofErr w:type="spellStart"/>
       <w:r>
         <w:rPr>
           <w:rFonts w:ascii="Times New Roman" w:eastAsiaTheme="majorEastAsia" w:hAnsi="Times New Roman" w:cs="Times New Roman"/>
@@ -7613,7 +7559,6 @@
         </w:rPr>
         <w:t>r_updatePrecoVenda</w:t>
       </w:r>
-      <w:proofErr w:type="spellEnd"/>
       <w:r>
         <w:rPr>
           <w:rFonts w:ascii="Times New Roman" w:eastAsiaTheme="majorEastAsia" w:hAnsi="Times New Roman" w:cs="Times New Roman"/>
@@ -7655,7 +7600,6 @@
           <w:lang w:val="pt-PT"/>
         </w:rPr>
       </w:pPr>
-      <w:proofErr w:type="spellStart"/>
       <w:r>
         <w:rPr>
           <w:rFonts w:ascii="Times New Roman" w:eastAsiaTheme="majorEastAsia" w:hAnsi="Times New Roman" w:cs="Times New Roman"/>
@@ -7679,7 +7623,6 @@
         </w:rPr>
         <w:t>_updatePrecoVenda</w:t>
       </w:r>
-      <w:proofErr w:type="spellEnd"/>
       <w:r>
         <w:rPr>
           <w:rFonts w:ascii="Times New Roman" w:eastAsiaTheme="majorEastAsia" w:hAnsi="Times New Roman" w:cs="Times New Roman"/>
@@ -7721,7 +7664,6 @@
           <w:lang w:val="pt-PT"/>
         </w:rPr>
       </w:pPr>
-      <w:proofErr w:type="spellStart"/>
       <w:r>
         <w:rPr>
           <w:rFonts w:ascii="Times New Roman" w:eastAsiaTheme="majorEastAsia" w:hAnsi="Times New Roman" w:cs="Times New Roman"/>
@@ -7744,7 +7686,6 @@
         </w:rPr>
         <w:t>_updateEstadoParcela</w:t>
       </w:r>
-      <w:proofErr w:type="spellEnd"/>
       <w:r>
         <w:rPr>
           <w:rFonts w:ascii="Times New Roman" w:eastAsiaTheme="majorEastAsia" w:hAnsi="Times New Roman" w:cs="Times New Roman"/>
@@ -7779,21 +7720,8 @@
           <w:szCs w:val="24"/>
           <w:lang w:val="pt-PT"/>
         </w:rPr>
-        <w:t xml:space="preserve">CREATE EVENT </w:t>
+        <w:t>CREATE EVENT evento_updateEstadoParcela</w:t>
       </w:r>
-      <w:proofErr w:type="spellStart"/>
-      <w:r>
-        <w:rPr>
-          <w:rFonts w:ascii="Times New Roman" w:eastAsiaTheme="majorEastAsia" w:hAnsi="Times New Roman" w:cs="Times New Roman"/>
-          <w:spacing w:val="5"/>
-          <w:kern w:val="28"/>
-          <w:sz w:val="24"/>
-          <w:szCs w:val="24"/>
-          <w:lang w:val="pt-PT"/>
-        </w:rPr>
-        <w:t>evento_updateEstadoParcela</w:t>
-      </w:r>
-      <w:proofErr w:type="spellEnd"/>
     </w:p>
     <w:p>
       <w:pPr>
@@ -7881,31 +7809,7 @@
           <w:lang w:val="pt-PT"/>
         </w:rPr>
         <w:tab/>
-        <w:t xml:space="preserve">CALL </w:t>
-      </w:r>
-      <w:proofErr w:type="spellStart"/>
-      <w:r>
-        <w:rPr>
-          <w:rFonts w:ascii="Times New Roman" w:eastAsiaTheme="majorEastAsia" w:hAnsi="Times New Roman" w:cs="Times New Roman"/>
-          <w:spacing w:val="5"/>
-          <w:kern w:val="28"/>
-          <w:sz w:val="24"/>
-          <w:szCs w:val="24"/>
-          <w:lang w:val="pt-PT"/>
-        </w:rPr>
-        <w:t>procedure_updateEstadoParcela</w:t>
-      </w:r>
-      <w:proofErr w:type="spellEnd"/>
-      <w:r>
-        <w:rPr>
-          <w:rFonts w:ascii="Times New Roman" w:eastAsiaTheme="majorEastAsia" w:hAnsi="Times New Roman" w:cs="Times New Roman"/>
-          <w:spacing w:val="5"/>
-          <w:kern w:val="28"/>
-          <w:sz w:val="24"/>
-          <w:szCs w:val="24"/>
-          <w:lang w:val="pt-PT"/>
-        </w:rPr>
-        <w:t>();</w:t>
+        <w:t>CALL procedure_updateEstadoParcela();</w:t>
       </w:r>
     </w:p>
     <w:p>
@@ -7969,31 +7873,7 @@
           <w:szCs w:val="24"/>
           <w:lang w:val="pt-PT"/>
         </w:rPr>
-        <w:t xml:space="preserve">CREATE PROCEDURE </w:t>
-      </w:r>
-      <w:proofErr w:type="spellStart"/>
-      <w:r>
-        <w:rPr>
-          <w:rFonts w:ascii="Times New Roman" w:eastAsiaTheme="majorEastAsia" w:hAnsi="Times New Roman" w:cs="Times New Roman"/>
-          <w:spacing w:val="5"/>
-          <w:kern w:val="28"/>
-          <w:sz w:val="24"/>
-          <w:szCs w:val="24"/>
-          <w:lang w:val="pt-PT"/>
-        </w:rPr>
-        <w:t>procedure_updateTaxaAtrasoParcela</w:t>
-      </w:r>
-      <w:proofErr w:type="spellEnd"/>
-      <w:r>
-        <w:rPr>
-          <w:rFonts w:ascii="Times New Roman" w:eastAsiaTheme="majorEastAsia" w:hAnsi="Times New Roman" w:cs="Times New Roman"/>
-          <w:spacing w:val="5"/>
-          <w:kern w:val="28"/>
-          <w:sz w:val="24"/>
-          <w:szCs w:val="24"/>
-          <w:lang w:val="pt-PT"/>
-        </w:rPr>
-        <w:t>()</w:t>
+        <w:t>CREATE PROCEDURE procedure_updateTaxaAtrasoParcela()</w:t>
       </w:r>
     </w:p>
     <w:p>
@@ -8018,21 +7898,8 @@
           <w:szCs w:val="24"/>
           <w:lang w:val="pt-PT"/>
         </w:rPr>
-        <w:t xml:space="preserve">CREATE EVENT </w:t>
+        <w:t>CREATE EVENT evento_updateTaxaAtrasoParcela</w:t>
       </w:r>
-      <w:proofErr w:type="spellStart"/>
-      <w:r>
-        <w:rPr>
-          <w:rFonts w:ascii="Times New Roman" w:eastAsiaTheme="majorEastAsia" w:hAnsi="Times New Roman" w:cs="Times New Roman"/>
-          <w:spacing w:val="5"/>
-          <w:kern w:val="28"/>
-          <w:sz w:val="24"/>
-          <w:szCs w:val="24"/>
-          <w:lang w:val="pt-PT"/>
-        </w:rPr>
-        <w:t>evento_updateTaxaAtrasoParcela</w:t>
-      </w:r>
-      <w:proofErr w:type="spellEnd"/>
     </w:p>
     <w:p>
       <w:pPr>
@@ -8120,31 +7987,7 @@
           <w:lang w:val="pt-PT"/>
         </w:rPr>
         <w:tab/>
-        <w:t xml:space="preserve">CALL </w:t>
-      </w:r>
-      <w:proofErr w:type="spellStart"/>
-      <w:r>
-        <w:rPr>
-          <w:rFonts w:ascii="Times New Roman" w:eastAsiaTheme="majorEastAsia" w:hAnsi="Times New Roman" w:cs="Times New Roman"/>
-          <w:spacing w:val="5"/>
-          <w:kern w:val="28"/>
-          <w:sz w:val="24"/>
-          <w:szCs w:val="24"/>
-          <w:lang w:val="pt-PT"/>
-        </w:rPr>
-        <w:t>procedure_updateTaxaAtrasoParcela</w:t>
-      </w:r>
-      <w:proofErr w:type="spellEnd"/>
-      <w:r>
-        <w:rPr>
-          <w:rFonts w:ascii="Times New Roman" w:eastAsiaTheme="majorEastAsia" w:hAnsi="Times New Roman" w:cs="Times New Roman"/>
-          <w:spacing w:val="5"/>
-          <w:kern w:val="28"/>
-          <w:sz w:val="24"/>
-          <w:szCs w:val="24"/>
-          <w:lang w:val="pt-PT"/>
-        </w:rPr>
-        <w:t xml:space="preserve">();        </w:t>
+        <w:t xml:space="preserve">CALL procedure_updateTaxaAtrasoParcela();        </w:t>
       </w:r>
     </w:p>
     <w:p>
@@ -8197,31 +8040,7 @@
           <w:szCs w:val="24"/>
           <w:lang w:val="pt-PT"/>
         </w:rPr>
-        <w:t xml:space="preserve">CREATE PROCEDURE </w:t>
-      </w:r>
-      <w:proofErr w:type="spellStart"/>
-      <w:r>
-        <w:rPr>
-          <w:rFonts w:ascii="Times New Roman" w:eastAsiaTheme="majorEastAsia" w:hAnsi="Times New Roman" w:cs="Times New Roman"/>
-          <w:spacing w:val="5"/>
-          <w:kern w:val="28"/>
-          <w:sz w:val="24"/>
-          <w:szCs w:val="24"/>
-          <w:lang w:val="pt-PT"/>
-        </w:rPr>
-        <w:t>procedure_updateSaldoFactura_com_Atraso_de_Parcela</w:t>
-      </w:r>
-      <w:proofErr w:type="spellEnd"/>
-      <w:r>
-        <w:rPr>
-          <w:rFonts w:ascii="Times New Roman" w:eastAsiaTheme="majorEastAsia" w:hAnsi="Times New Roman" w:cs="Times New Roman"/>
-          <w:spacing w:val="5"/>
-          <w:kern w:val="28"/>
-          <w:sz w:val="24"/>
-          <w:szCs w:val="24"/>
-          <w:lang w:val="pt-PT"/>
-        </w:rPr>
-        <w:t>()</w:t>
+        <w:t>CREATE PROCEDURE procedure_updateSaldoFactura_com_Atraso_de_Parcela()</w:t>
       </w:r>
     </w:p>
     <w:p>
@@ -8246,21 +8065,8 @@
           <w:szCs w:val="24"/>
           <w:lang w:val="pt-PT"/>
         </w:rPr>
-        <w:t xml:space="preserve">CREATE EVENT </w:t>
+        <w:t>CREATE EVENT evento_updateSaldoFactura_com_Atraso_de_Parcela</w:t>
       </w:r>
-      <w:proofErr w:type="spellStart"/>
-      <w:r>
-        <w:rPr>
-          <w:rFonts w:ascii="Times New Roman" w:eastAsiaTheme="majorEastAsia" w:hAnsi="Times New Roman" w:cs="Times New Roman"/>
-          <w:spacing w:val="5"/>
-          <w:kern w:val="28"/>
-          <w:sz w:val="24"/>
-          <w:szCs w:val="24"/>
-          <w:lang w:val="pt-PT"/>
-        </w:rPr>
-        <w:t>evento_updateSaldoFactura_com_Atraso_de_Parcela</w:t>
-      </w:r>
-      <w:proofErr w:type="spellEnd"/>
     </w:p>
     <w:p>
       <w:pPr>
@@ -8349,31 +8155,7 @@
           <w:lang w:val="pt-PT"/>
         </w:rPr>
         <w:tab/>
-        <w:t xml:space="preserve">CALL </w:t>
-      </w:r>
-      <w:proofErr w:type="spellStart"/>
-      <w:r>
-        <w:rPr>
-          <w:rFonts w:ascii="Times New Roman" w:eastAsiaTheme="majorEastAsia" w:hAnsi="Times New Roman" w:cs="Times New Roman"/>
-          <w:spacing w:val="5"/>
-          <w:kern w:val="28"/>
-          <w:sz w:val="24"/>
-          <w:szCs w:val="24"/>
-          <w:lang w:val="pt-PT"/>
-        </w:rPr>
-        <w:t>procedure_updateSaldoFactura_com_Atraso_de_Parcela</w:t>
-      </w:r>
-      <w:proofErr w:type="spellEnd"/>
-      <w:r>
-        <w:rPr>
-          <w:rFonts w:ascii="Times New Roman" w:eastAsiaTheme="majorEastAsia" w:hAnsi="Times New Roman" w:cs="Times New Roman"/>
-          <w:spacing w:val="5"/>
-          <w:kern w:val="28"/>
-          <w:sz w:val="24"/>
-          <w:szCs w:val="24"/>
-          <w:lang w:val="pt-PT"/>
-        </w:rPr>
-        <w:t>();</w:t>
+        <w:t>CALL procedure_updateSaldoFactura_com_Atraso_de_Parcela();</w:t>
       </w:r>
     </w:p>
     <w:p>
@@ -9227,23 +9009,7 @@
           <w:rFonts w:ascii="Times New Roman" w:hAnsi="Times New Roman" w:cs="Times New Roman"/>
           <w:lang w:val="pt-PT"/>
         </w:rPr>
-        <w:t xml:space="preserve">Esta documentação será continuamente atualizada conforme o desenvolvimento do sistema avança. Recomenda-se a </w:t>
-      </w:r>
-      <w:proofErr w:type="spellStart"/>
-      <w:r>
-        <w:rPr>
-          <w:rFonts w:ascii="Times New Roman" w:hAnsi="Times New Roman" w:cs="Times New Roman"/>
-          <w:lang w:val="pt-PT"/>
-        </w:rPr>
-        <w:t>versãoamento</w:t>
-      </w:r>
-      <w:proofErr w:type="spellEnd"/>
-      <w:r>
-        <w:rPr>
-          <w:rFonts w:ascii="Times New Roman" w:hAnsi="Times New Roman" w:cs="Times New Roman"/>
-          <w:lang w:val="pt-PT"/>
-        </w:rPr>
-        <w:t xml:space="preserve"> frequente do banco de dados e o acompanhamento contínuo do modelo físico, garantindo integridade, escalabilidade e segurança dos dados.</w:t>
+        <w:t>Esta documentação será continuamente atualizada conforme o desenvolvimento do sistema avança. Recomenda-se a versãoamento frequente do banco de dados e o acompanhamento contínuo do modelo físico, garantindo integridade, escalabilidade e segurança dos dados.</w:t>
       </w:r>
     </w:p>
     <w:sectPr>

</xml_diff>

<commit_message>
ajuste para nao comercializacao abaixo acima do estoque adicionado
</commit_message>
<xml_diff>
--- a/Documentacao_Projeto_JM-InvSM.docx
+++ b/Documentacao_Projeto_JM-InvSM.docx
@@ -173,6 +173,31 @@
           <w:lang w:val="pt-PT"/>
         </w:rPr>
         <w:t>16 DE AGOSTO DE 2024</w:t>
+      </w:r>
+    </w:p>
+    <w:p>
+      <w:pPr>
+        <w:spacing w:line="360" w:lineRule="auto"/>
+        <w:jc w:val="center"/>
+        <w:rPr>
+          <w:rFonts w:ascii="Times New Roman" w:hAnsi="Times New Roman" w:cs="Times New Roman"/>
+          <w:b/>
+          <w:bCs/>
+          <w:sz w:val="36"/>
+          <w:szCs w:val="36"/>
+          <w:lang w:val="pt-PT"/>
+        </w:rPr>
+      </w:pPr>
+      <w:r>
+        <w:rPr>
+          <w:rFonts w:ascii="Times New Roman" w:hAnsi="Times New Roman" w:cs="Times New Roman"/>
+          <w:b/>
+          <w:bCs/>
+          <w:sz w:val="36"/>
+          <w:szCs w:val="36"/>
+          <w:lang w:val="pt-PT"/>
+        </w:rPr>
+        <w:t>Fazer código de Emissão de alertas na vendas quando não houver stock suficiente</w:t>
       </w:r>
       <w:r>
         <w:rPr>
@@ -4324,6 +4349,7 @@
                 <w:lang w:val="pt-PT"/>
               </w:rPr>
             </w:pPr>
+            <w:proofErr w:type="spellStart"/>
             <w:r>
               <w:rPr>
                 <w:rFonts w:ascii="Times New Roman" w:hAnsi="Times New Roman" w:cs="Times New Roman"/>
@@ -4340,13 +4366,86 @@
               </w:rPr>
               <w:t>r</w:t>
             </w:r>
+            <w:proofErr w:type="spellEnd"/>
             <w:r>
               <w:rPr>
                 <w:rFonts w:ascii="Times New Roman" w:hAnsi="Times New Roman" w:cs="Times New Roman"/>
                 <w:sz w:val="20"/>
                 <w:szCs w:val="20"/>
               </w:rPr>
-              <w:t xml:space="preserve"> informações sobre estrutura, índices e performance</w:t>
+              <w:t xml:space="preserve"> </w:t>
+            </w:r>
+            <w:proofErr w:type="spellStart"/>
+            <w:r>
+              <w:rPr>
+                <w:rFonts w:ascii="Times New Roman" w:hAnsi="Times New Roman" w:cs="Times New Roman"/>
+                <w:sz w:val="20"/>
+                <w:szCs w:val="20"/>
+              </w:rPr>
+              <w:t>informações</w:t>
+            </w:r>
+            <w:proofErr w:type="spellEnd"/>
+            <w:r>
+              <w:rPr>
+                <w:rFonts w:ascii="Times New Roman" w:hAnsi="Times New Roman" w:cs="Times New Roman"/>
+                <w:sz w:val="20"/>
+                <w:szCs w:val="20"/>
+              </w:rPr>
+              <w:t xml:space="preserve"> </w:t>
+            </w:r>
+            <w:proofErr w:type="spellStart"/>
+            <w:r>
+              <w:rPr>
+                <w:rFonts w:ascii="Times New Roman" w:hAnsi="Times New Roman" w:cs="Times New Roman"/>
+                <w:sz w:val="20"/>
+                <w:szCs w:val="20"/>
+              </w:rPr>
+              <w:t>sobre</w:t>
+            </w:r>
+            <w:proofErr w:type="spellEnd"/>
+            <w:r>
+              <w:rPr>
+                <w:rFonts w:ascii="Times New Roman" w:hAnsi="Times New Roman" w:cs="Times New Roman"/>
+                <w:sz w:val="20"/>
+                <w:szCs w:val="20"/>
+              </w:rPr>
+              <w:t xml:space="preserve"> </w:t>
+            </w:r>
+            <w:proofErr w:type="spellStart"/>
+            <w:r>
+              <w:rPr>
+                <w:rFonts w:ascii="Times New Roman" w:hAnsi="Times New Roman" w:cs="Times New Roman"/>
+                <w:sz w:val="20"/>
+                <w:szCs w:val="20"/>
+              </w:rPr>
+              <w:t>estrutura</w:t>
+            </w:r>
+            <w:proofErr w:type="spellEnd"/>
+            <w:r>
+              <w:rPr>
+                <w:rFonts w:ascii="Times New Roman" w:hAnsi="Times New Roman" w:cs="Times New Roman"/>
+                <w:sz w:val="20"/>
+                <w:szCs w:val="20"/>
+              </w:rPr>
+              <w:t xml:space="preserve">, </w:t>
+            </w:r>
+            <w:proofErr w:type="spellStart"/>
+            <w:r>
+              <w:rPr>
+                <w:rFonts w:ascii="Times New Roman" w:hAnsi="Times New Roman" w:cs="Times New Roman"/>
+                <w:sz w:val="20"/>
+                <w:szCs w:val="20"/>
+              </w:rPr>
+              <w:t>índices</w:t>
+            </w:r>
+            <w:proofErr w:type="spellEnd"/>
+            <w:r>
+              <w:rPr>
+                <w:rFonts w:ascii="Times New Roman" w:hAnsi="Times New Roman" w:cs="Times New Roman"/>
+                <w:sz w:val="20"/>
+                <w:szCs w:val="20"/>
+              </w:rPr>
+              <w:t xml:space="preserve"> e performance</w:t>
             </w:r>
           </w:p>
         </w:tc>
@@ -4694,14 +4793,70 @@
                 <w:lang w:val="pt-PT"/>
               </w:rPr>
             </w:pPr>
+            <w:proofErr w:type="spellStart"/>
             <w:r>
               <w:rPr>
                 <w:rFonts w:ascii="Times New Roman" w:hAnsi="Times New Roman" w:cs="Times New Roman"/>
                 <w:sz w:val="20"/>
                 <w:szCs w:val="20"/>
               </w:rPr>
-              <w:t>Explica relatórios e interpreta dados de faturas</w:t>
-            </w:r>
+              <w:t>Explica</w:t>
+            </w:r>
+            <w:proofErr w:type="spellEnd"/>
+            <w:r>
+              <w:rPr>
+                <w:rFonts w:ascii="Times New Roman" w:hAnsi="Times New Roman" w:cs="Times New Roman"/>
+                <w:sz w:val="20"/>
+                <w:szCs w:val="20"/>
+              </w:rPr>
+              <w:t xml:space="preserve"> </w:t>
+            </w:r>
+            <w:proofErr w:type="spellStart"/>
+            <w:r>
+              <w:rPr>
+                <w:rFonts w:ascii="Times New Roman" w:hAnsi="Times New Roman" w:cs="Times New Roman"/>
+                <w:sz w:val="20"/>
+                <w:szCs w:val="20"/>
+              </w:rPr>
+              <w:t>relatórios</w:t>
+            </w:r>
+            <w:proofErr w:type="spellEnd"/>
+            <w:r>
+              <w:rPr>
+                <w:rFonts w:ascii="Times New Roman" w:hAnsi="Times New Roman" w:cs="Times New Roman"/>
+                <w:sz w:val="20"/>
+                <w:szCs w:val="20"/>
+              </w:rPr>
+              <w:t xml:space="preserve"> e </w:t>
+            </w:r>
+            <w:proofErr w:type="spellStart"/>
+            <w:r>
+              <w:rPr>
+                <w:rFonts w:ascii="Times New Roman" w:hAnsi="Times New Roman" w:cs="Times New Roman"/>
+                <w:sz w:val="20"/>
+                <w:szCs w:val="20"/>
+              </w:rPr>
+              <w:t>interpreta</w:t>
+            </w:r>
+            <w:proofErr w:type="spellEnd"/>
+            <w:r>
+              <w:rPr>
+                <w:rFonts w:ascii="Times New Roman" w:hAnsi="Times New Roman" w:cs="Times New Roman"/>
+                <w:sz w:val="20"/>
+                <w:szCs w:val="20"/>
+              </w:rPr>
+              <w:t xml:space="preserve"> dados de </w:t>
+            </w:r>
+            <w:proofErr w:type="spellStart"/>
+            <w:r>
+              <w:rPr>
+                <w:rFonts w:ascii="Times New Roman" w:hAnsi="Times New Roman" w:cs="Times New Roman"/>
+                <w:sz w:val="20"/>
+                <w:szCs w:val="20"/>
+              </w:rPr>
+              <w:t>faturas</w:t>
+            </w:r>
+            <w:proofErr w:type="spellEnd"/>
           </w:p>
         </w:tc>
       </w:tr>
@@ -4808,8 +4963,54 @@
                 <w:sz w:val="20"/>
                 <w:szCs w:val="20"/>
               </w:rPr>
-              <w:t>Informa origem e movimentação de produtos</w:t>
-            </w:r>
+              <w:t xml:space="preserve">Informa </w:t>
+            </w:r>
+            <w:proofErr w:type="spellStart"/>
+            <w:r>
+              <w:rPr>
+                <w:rFonts w:ascii="Times New Roman" w:hAnsi="Times New Roman" w:cs="Times New Roman"/>
+                <w:sz w:val="20"/>
+                <w:szCs w:val="20"/>
+              </w:rPr>
+              <w:t>origem</w:t>
+            </w:r>
+            <w:proofErr w:type="spellEnd"/>
+            <w:r>
+              <w:rPr>
+                <w:rFonts w:ascii="Times New Roman" w:hAnsi="Times New Roman" w:cs="Times New Roman"/>
+                <w:sz w:val="20"/>
+                <w:szCs w:val="20"/>
+              </w:rPr>
+              <w:t xml:space="preserve"> e </w:t>
+            </w:r>
+            <w:proofErr w:type="spellStart"/>
+            <w:r>
+              <w:rPr>
+                <w:rFonts w:ascii="Times New Roman" w:hAnsi="Times New Roman" w:cs="Times New Roman"/>
+                <w:sz w:val="20"/>
+                <w:szCs w:val="20"/>
+              </w:rPr>
+              <w:t>movimentação</w:t>
+            </w:r>
+            <w:proofErr w:type="spellEnd"/>
+            <w:r>
+              <w:rPr>
+                <w:rFonts w:ascii="Times New Roman" w:hAnsi="Times New Roman" w:cs="Times New Roman"/>
+                <w:sz w:val="20"/>
+                <w:szCs w:val="20"/>
+              </w:rPr>
+              <w:t xml:space="preserve"> de </w:t>
+            </w:r>
+            <w:proofErr w:type="spellStart"/>
+            <w:r>
+              <w:rPr>
+                <w:rFonts w:ascii="Times New Roman" w:hAnsi="Times New Roman" w:cs="Times New Roman"/>
+                <w:sz w:val="20"/>
+                <w:szCs w:val="20"/>
+              </w:rPr>
+              <w:t>produtos</w:t>
+            </w:r>
+            <w:proofErr w:type="spellEnd"/>
           </w:p>
         </w:tc>
       </w:tr>
@@ -4907,14 +5108,70 @@
                 <w:lang w:val="pt-PT"/>
               </w:rPr>
             </w:pPr>
+            <w:proofErr w:type="spellStart"/>
             <w:r>
               <w:rPr>
                 <w:rFonts w:ascii="Times New Roman" w:hAnsi="Times New Roman" w:cs="Times New Roman"/>
                 <w:sz w:val="20"/>
                 <w:szCs w:val="20"/>
               </w:rPr>
-              <w:t>Explica lançamentos financeiros e reconciliação</w:t>
-            </w:r>
+              <w:t>Explica</w:t>
+            </w:r>
+            <w:proofErr w:type="spellEnd"/>
+            <w:r>
+              <w:rPr>
+                <w:rFonts w:ascii="Times New Roman" w:hAnsi="Times New Roman" w:cs="Times New Roman"/>
+                <w:sz w:val="20"/>
+                <w:szCs w:val="20"/>
+              </w:rPr>
+              <w:t xml:space="preserve"> </w:t>
+            </w:r>
+            <w:proofErr w:type="spellStart"/>
+            <w:r>
+              <w:rPr>
+                <w:rFonts w:ascii="Times New Roman" w:hAnsi="Times New Roman" w:cs="Times New Roman"/>
+                <w:sz w:val="20"/>
+                <w:szCs w:val="20"/>
+              </w:rPr>
+              <w:t>lançamentos</w:t>
+            </w:r>
+            <w:proofErr w:type="spellEnd"/>
+            <w:r>
+              <w:rPr>
+                <w:rFonts w:ascii="Times New Roman" w:hAnsi="Times New Roman" w:cs="Times New Roman"/>
+                <w:sz w:val="20"/>
+                <w:szCs w:val="20"/>
+              </w:rPr>
+              <w:t xml:space="preserve"> </w:t>
+            </w:r>
+            <w:proofErr w:type="spellStart"/>
+            <w:r>
+              <w:rPr>
+                <w:rFonts w:ascii="Times New Roman" w:hAnsi="Times New Roman" w:cs="Times New Roman"/>
+                <w:sz w:val="20"/>
+                <w:szCs w:val="20"/>
+              </w:rPr>
+              <w:t>financeiros</w:t>
+            </w:r>
+            <w:proofErr w:type="spellEnd"/>
+            <w:r>
+              <w:rPr>
+                <w:rFonts w:ascii="Times New Roman" w:hAnsi="Times New Roman" w:cs="Times New Roman"/>
+                <w:sz w:val="20"/>
+                <w:szCs w:val="20"/>
+              </w:rPr>
+              <w:t xml:space="preserve"> e </w:t>
+            </w:r>
+            <w:proofErr w:type="spellStart"/>
+            <w:r>
+              <w:rPr>
+                <w:rFonts w:ascii="Times New Roman" w:hAnsi="Times New Roman" w:cs="Times New Roman"/>
+                <w:sz w:val="20"/>
+                <w:szCs w:val="20"/>
+              </w:rPr>
+              <w:t>reconciliação</w:t>
+            </w:r>
+            <w:proofErr w:type="spellEnd"/>
           </w:p>
         </w:tc>
       </w:tr>
@@ -7537,6 +7794,7 @@
           <w:lang w:val="pt-PT"/>
         </w:rPr>
       </w:pPr>
+      <w:proofErr w:type="spellStart"/>
       <w:r>
         <w:rPr>
           <w:rFonts w:ascii="Times New Roman" w:eastAsiaTheme="majorEastAsia" w:hAnsi="Times New Roman" w:cs="Times New Roman"/>
@@ -7559,6 +7817,7 @@
         </w:rPr>
         <w:t>r_updatePrecoVenda</w:t>
       </w:r>
+      <w:proofErr w:type="spellEnd"/>
       <w:r>
         <w:rPr>
           <w:rFonts w:ascii="Times New Roman" w:eastAsiaTheme="majorEastAsia" w:hAnsi="Times New Roman" w:cs="Times New Roman"/>
@@ -7600,6 +7859,7 @@
           <w:lang w:val="pt-PT"/>
         </w:rPr>
       </w:pPr>
+      <w:proofErr w:type="spellStart"/>
       <w:r>
         <w:rPr>
           <w:rFonts w:ascii="Times New Roman" w:eastAsiaTheme="majorEastAsia" w:hAnsi="Times New Roman" w:cs="Times New Roman"/>
@@ -7623,6 +7883,7 @@
         </w:rPr>
         <w:t>_updatePrecoVenda</w:t>
       </w:r>
+      <w:proofErr w:type="spellEnd"/>
       <w:r>
         <w:rPr>
           <w:rFonts w:ascii="Times New Roman" w:eastAsiaTheme="majorEastAsia" w:hAnsi="Times New Roman" w:cs="Times New Roman"/>
@@ -7664,6 +7925,7 @@
           <w:lang w:val="pt-PT"/>
         </w:rPr>
       </w:pPr>
+      <w:proofErr w:type="spellStart"/>
       <w:r>
         <w:rPr>
           <w:rFonts w:ascii="Times New Roman" w:eastAsiaTheme="majorEastAsia" w:hAnsi="Times New Roman" w:cs="Times New Roman"/>
@@ -7686,6 +7948,7 @@
         </w:rPr>
         <w:t>_updateEstadoParcela</w:t>
       </w:r>
+      <w:proofErr w:type="spellEnd"/>
       <w:r>
         <w:rPr>
           <w:rFonts w:ascii="Times New Roman" w:eastAsiaTheme="majorEastAsia" w:hAnsi="Times New Roman" w:cs="Times New Roman"/>
@@ -7720,8 +7983,32 @@
           <w:szCs w:val="24"/>
           <w:lang w:val="pt-PT"/>
         </w:rPr>
-        <w:t>CREATE EVENT evento_updateEstadoParcela</w:t>
-      </w:r>
+        <w:t xml:space="preserve">CREATE EVENT </w:t>
+      </w:r>
+      <w:proofErr w:type="spellStart"/>
+      <w:r>
+        <w:rPr>
+          <w:rFonts w:ascii="Times New Roman" w:eastAsiaTheme="majorEastAsia" w:hAnsi="Times New Roman" w:cs="Times New Roman"/>
+          <w:spacing w:val="5"/>
+          <w:kern w:val="28"/>
+          <w:sz w:val="24"/>
+          <w:szCs w:val="24"/>
+          <w:lang w:val="pt-PT"/>
+        </w:rPr>
+        <w:t>Evt</w:t>
+      </w:r>
+      <w:r>
+        <w:rPr>
+          <w:rFonts w:ascii="Times New Roman" w:eastAsiaTheme="majorEastAsia" w:hAnsi="Times New Roman" w:cs="Times New Roman"/>
+          <w:spacing w:val="5"/>
+          <w:kern w:val="28"/>
+          <w:sz w:val="24"/>
+          <w:szCs w:val="24"/>
+          <w:lang w:val="pt-PT"/>
+        </w:rPr>
+        <w:t>_updateEstadoParcela</w:t>
+      </w:r>
+      <w:proofErr w:type="spellEnd"/>
     </w:p>
     <w:p>
       <w:pPr>
@@ -7809,7 +8096,31 @@
           <w:lang w:val="pt-PT"/>
         </w:rPr>
         <w:tab/>
-        <w:t>CALL procedure_updateEstadoParcela();</w:t>
+        <w:t xml:space="preserve">CALL </w:t>
+      </w:r>
+      <w:proofErr w:type="spellStart"/>
+      <w:r>
+        <w:rPr>
+          <w:rFonts w:ascii="Times New Roman" w:eastAsiaTheme="majorEastAsia" w:hAnsi="Times New Roman" w:cs="Times New Roman"/>
+          <w:spacing w:val="5"/>
+          <w:kern w:val="28"/>
+          <w:sz w:val="24"/>
+          <w:szCs w:val="24"/>
+          <w:lang w:val="pt-PT"/>
+        </w:rPr>
+        <w:t>procedure_updateEstadoParcela</w:t>
+      </w:r>
+      <w:proofErr w:type="spellEnd"/>
+      <w:r>
+        <w:rPr>
+          <w:rFonts w:ascii="Times New Roman" w:eastAsiaTheme="majorEastAsia" w:hAnsi="Times New Roman" w:cs="Times New Roman"/>
+          <w:spacing w:val="5"/>
+          <w:kern w:val="28"/>
+          <w:sz w:val="24"/>
+          <w:szCs w:val="24"/>
+          <w:lang w:val="pt-PT"/>
+        </w:rPr>
+        <w:t>();</w:t>
       </w:r>
     </w:p>
     <w:p>
@@ -7873,7 +8184,42 @@
           <w:szCs w:val="24"/>
           <w:lang w:val="pt-PT"/>
         </w:rPr>
-        <w:t>CREATE PROCEDURE procedure_updateTaxaAtrasoParcela()</w:t>
+        <w:t xml:space="preserve">CREATE PROCEDURE </w:t>
+      </w:r>
+      <w:proofErr w:type="spellStart"/>
+      <w:r>
+        <w:rPr>
+          <w:rFonts w:ascii="Times New Roman" w:eastAsiaTheme="majorEastAsia" w:hAnsi="Times New Roman" w:cs="Times New Roman"/>
+          <w:spacing w:val="5"/>
+          <w:kern w:val="28"/>
+          <w:sz w:val="24"/>
+          <w:szCs w:val="24"/>
+          <w:lang w:val="pt-PT"/>
+        </w:rPr>
+        <w:t>Pr</w:t>
+      </w:r>
+      <w:r>
+        <w:rPr>
+          <w:rFonts w:ascii="Times New Roman" w:eastAsiaTheme="majorEastAsia" w:hAnsi="Times New Roman" w:cs="Times New Roman"/>
+          <w:spacing w:val="5"/>
+          <w:kern w:val="28"/>
+          <w:sz w:val="24"/>
+          <w:szCs w:val="24"/>
+          <w:lang w:val="pt-PT"/>
+        </w:rPr>
+        <w:t>_updateTaxaAtrasoParcela</w:t>
+      </w:r>
+      <w:proofErr w:type="spellEnd"/>
+      <w:r>
+        <w:rPr>
+          <w:rFonts w:ascii="Times New Roman" w:eastAsiaTheme="majorEastAsia" w:hAnsi="Times New Roman" w:cs="Times New Roman"/>
+          <w:spacing w:val="5"/>
+          <w:kern w:val="28"/>
+          <w:sz w:val="24"/>
+          <w:szCs w:val="24"/>
+          <w:lang w:val="pt-PT"/>
+        </w:rPr>
+        <w:t>()</w:t>
       </w:r>
     </w:p>
     <w:p>
@@ -7898,8 +8244,32 @@
           <w:szCs w:val="24"/>
           <w:lang w:val="pt-PT"/>
         </w:rPr>
-        <w:t>CREATE EVENT evento_updateTaxaAtrasoParcela</w:t>
-      </w:r>
+        <w:t xml:space="preserve">CREATE EVENT </w:t>
+      </w:r>
+      <w:proofErr w:type="spellStart"/>
+      <w:r>
+        <w:rPr>
+          <w:rFonts w:ascii="Times New Roman" w:eastAsiaTheme="majorEastAsia" w:hAnsi="Times New Roman" w:cs="Times New Roman"/>
+          <w:spacing w:val="5"/>
+          <w:kern w:val="28"/>
+          <w:sz w:val="24"/>
+          <w:szCs w:val="24"/>
+          <w:lang w:val="pt-PT"/>
+        </w:rPr>
+        <w:t>Evt</w:t>
+      </w:r>
+      <w:r>
+        <w:rPr>
+          <w:rFonts w:ascii="Times New Roman" w:eastAsiaTheme="majorEastAsia" w:hAnsi="Times New Roman" w:cs="Times New Roman"/>
+          <w:spacing w:val="5"/>
+          <w:kern w:val="28"/>
+          <w:sz w:val="24"/>
+          <w:szCs w:val="24"/>
+          <w:lang w:val="pt-PT"/>
+        </w:rPr>
+        <w:t>_updateTaxaAtrasoParcela</w:t>
+      </w:r>
+      <w:proofErr w:type="spellEnd"/>
     </w:p>
     <w:p>
       <w:pPr>
@@ -7987,7 +8357,53 @@
           <w:lang w:val="pt-PT"/>
         </w:rPr>
         <w:tab/>
-        <w:t xml:space="preserve">CALL procedure_updateTaxaAtrasoParcela();        </w:t>
+        <w:t xml:space="preserve">CALL </w:t>
+      </w:r>
+      <w:proofErr w:type="spellStart"/>
+      <w:r>
+        <w:rPr>
+          <w:rFonts w:ascii="Times New Roman" w:eastAsiaTheme="majorEastAsia" w:hAnsi="Times New Roman" w:cs="Times New Roman"/>
+          <w:spacing w:val="5"/>
+          <w:kern w:val="28"/>
+          <w:sz w:val="24"/>
+          <w:szCs w:val="24"/>
+          <w:lang w:val="pt-PT"/>
+        </w:rPr>
+        <w:t>Pr</w:t>
+      </w:r>
+      <w:r>
+        <w:rPr>
+          <w:rFonts w:ascii="Times New Roman" w:eastAsiaTheme="majorEastAsia" w:hAnsi="Times New Roman" w:cs="Times New Roman"/>
+          <w:spacing w:val="5"/>
+          <w:kern w:val="28"/>
+          <w:sz w:val="24"/>
+          <w:szCs w:val="24"/>
+          <w:lang w:val="pt-PT"/>
+        </w:rPr>
+        <w:t>_updateTaxaAtrasoParcela</w:t>
+      </w:r>
+      <w:proofErr w:type="spellEnd"/>
+      <w:r>
+        <w:rPr>
+          <w:rFonts w:ascii="Times New Roman" w:eastAsiaTheme="majorEastAsia" w:hAnsi="Times New Roman" w:cs="Times New Roman"/>
+          <w:spacing w:val="5"/>
+          <w:kern w:val="28"/>
+          <w:sz w:val="24"/>
+          <w:szCs w:val="24"/>
+          <w:lang w:val="pt-PT"/>
+        </w:rPr>
+        <w:t xml:space="preserve"> </w:t>
+      </w:r>
+      <w:r>
+        <w:rPr>
+          <w:rFonts w:ascii="Times New Roman" w:eastAsiaTheme="majorEastAsia" w:hAnsi="Times New Roman" w:cs="Times New Roman"/>
+          <w:spacing w:val="5"/>
+          <w:kern w:val="28"/>
+          <w:sz w:val="24"/>
+          <w:szCs w:val="24"/>
+          <w:lang w:val="pt-PT"/>
+        </w:rPr>
+        <w:t xml:space="preserve">();        </w:t>
       </w:r>
     </w:p>
     <w:p>
@@ -8040,7 +8456,42 @@
           <w:szCs w:val="24"/>
           <w:lang w:val="pt-PT"/>
         </w:rPr>
-        <w:t>CREATE PROCEDURE procedure_updateSaldoFactura_com_Atraso_de_Parcela()</w:t>
+        <w:t xml:space="preserve">CREATE PROCEDURE </w:t>
+      </w:r>
+      <w:proofErr w:type="spellStart"/>
+      <w:r>
+        <w:rPr>
+          <w:rFonts w:ascii="Times New Roman" w:eastAsiaTheme="majorEastAsia" w:hAnsi="Times New Roman" w:cs="Times New Roman"/>
+          <w:spacing w:val="5"/>
+          <w:kern w:val="28"/>
+          <w:sz w:val="24"/>
+          <w:szCs w:val="24"/>
+          <w:lang w:val="pt-PT"/>
+        </w:rPr>
+        <w:t>Pr</w:t>
+      </w:r>
+      <w:r>
+        <w:rPr>
+          <w:rFonts w:ascii="Times New Roman" w:eastAsiaTheme="majorEastAsia" w:hAnsi="Times New Roman" w:cs="Times New Roman"/>
+          <w:spacing w:val="5"/>
+          <w:kern w:val="28"/>
+          <w:sz w:val="24"/>
+          <w:szCs w:val="24"/>
+          <w:lang w:val="pt-PT"/>
+        </w:rPr>
+        <w:t>_updateSaldoFactura_com_Atraso_de_Parcela</w:t>
+      </w:r>
+      <w:proofErr w:type="spellEnd"/>
+      <w:r>
+        <w:rPr>
+          <w:rFonts w:ascii="Times New Roman" w:eastAsiaTheme="majorEastAsia" w:hAnsi="Times New Roman" w:cs="Times New Roman"/>
+          <w:spacing w:val="5"/>
+          <w:kern w:val="28"/>
+          <w:sz w:val="24"/>
+          <w:szCs w:val="24"/>
+          <w:lang w:val="pt-PT"/>
+        </w:rPr>
+        <w:t>()</w:t>
       </w:r>
     </w:p>
     <w:p>
@@ -8065,8 +8516,32 @@
           <w:szCs w:val="24"/>
           <w:lang w:val="pt-PT"/>
         </w:rPr>
-        <w:t>CREATE EVENT evento_updateSaldoFactura_com_Atraso_de_Parcela</w:t>
-      </w:r>
+        <w:t xml:space="preserve">CREATE EVENT </w:t>
+      </w:r>
+      <w:proofErr w:type="spellStart"/>
+      <w:r>
+        <w:rPr>
+          <w:rFonts w:ascii="Times New Roman" w:eastAsiaTheme="majorEastAsia" w:hAnsi="Times New Roman" w:cs="Times New Roman"/>
+          <w:spacing w:val="5"/>
+          <w:kern w:val="28"/>
+          <w:sz w:val="24"/>
+          <w:szCs w:val="24"/>
+          <w:lang w:val="pt-PT"/>
+        </w:rPr>
+        <w:t>Evt</w:t>
+      </w:r>
+      <w:r>
+        <w:rPr>
+          <w:rFonts w:ascii="Times New Roman" w:eastAsiaTheme="majorEastAsia" w:hAnsi="Times New Roman" w:cs="Times New Roman"/>
+          <w:spacing w:val="5"/>
+          <w:kern w:val="28"/>
+          <w:sz w:val="24"/>
+          <w:szCs w:val="24"/>
+          <w:lang w:val="pt-PT"/>
+        </w:rPr>
+        <w:t>_updateSaldoFactura_com_Atraso_de_Parcela</w:t>
+      </w:r>
+      <w:proofErr w:type="spellEnd"/>
     </w:p>
     <w:p>
       <w:pPr>
@@ -8155,7 +8630,42 @@
           <w:lang w:val="pt-PT"/>
         </w:rPr>
         <w:tab/>
-        <w:t>CALL procedure_updateSaldoFactura_com_Atraso_de_Parcela();</w:t>
+        <w:t xml:space="preserve">CALL </w:t>
+      </w:r>
+      <w:proofErr w:type="spellStart"/>
+      <w:r>
+        <w:rPr>
+          <w:rFonts w:ascii="Times New Roman" w:eastAsiaTheme="majorEastAsia" w:hAnsi="Times New Roman" w:cs="Times New Roman"/>
+          <w:spacing w:val="5"/>
+          <w:kern w:val="28"/>
+          <w:sz w:val="24"/>
+          <w:szCs w:val="24"/>
+          <w:lang w:val="pt-PT"/>
+        </w:rPr>
+        <w:t>Pr</w:t>
+      </w:r>
+      <w:r>
+        <w:rPr>
+          <w:rFonts w:ascii="Times New Roman" w:eastAsiaTheme="majorEastAsia" w:hAnsi="Times New Roman" w:cs="Times New Roman"/>
+          <w:spacing w:val="5"/>
+          <w:kern w:val="28"/>
+          <w:sz w:val="24"/>
+          <w:szCs w:val="24"/>
+          <w:lang w:val="pt-PT"/>
+        </w:rPr>
+        <w:t>_updateSaldoFactura_com_Atraso_de_Parcela</w:t>
+      </w:r>
+      <w:proofErr w:type="spellEnd"/>
+      <w:r>
+        <w:rPr>
+          <w:rFonts w:ascii="Times New Roman" w:eastAsiaTheme="majorEastAsia" w:hAnsi="Times New Roman" w:cs="Times New Roman"/>
+          <w:spacing w:val="5"/>
+          <w:kern w:val="28"/>
+          <w:sz w:val="24"/>
+          <w:szCs w:val="24"/>
+          <w:lang w:val="pt-PT"/>
+        </w:rPr>
+        <w:t>();</w:t>
       </w:r>
     </w:p>
     <w:p>
@@ -9009,7 +9519,23 @@
           <w:rFonts w:ascii="Times New Roman" w:hAnsi="Times New Roman" w:cs="Times New Roman"/>
           <w:lang w:val="pt-PT"/>
         </w:rPr>
-        <w:t>Esta documentação será continuamente atualizada conforme o desenvolvimento do sistema avança. Recomenda-se a versãoamento frequente do banco de dados e o acompanhamento contínuo do modelo físico, garantindo integridade, escalabilidade e segurança dos dados.</w:t>
+        <w:t xml:space="preserve">Esta documentação será continuamente atualizada conforme o desenvolvimento do sistema avança. Recomenda-se a </w:t>
+      </w:r>
+      <w:proofErr w:type="spellStart"/>
+      <w:r>
+        <w:rPr>
+          <w:rFonts w:ascii="Times New Roman" w:hAnsi="Times New Roman" w:cs="Times New Roman"/>
+          <w:lang w:val="pt-PT"/>
+        </w:rPr>
+        <w:t>versãoamento</w:t>
+      </w:r>
+      <w:proofErr w:type="spellEnd"/>
+      <w:r>
+        <w:rPr>
+          <w:rFonts w:ascii="Times New Roman" w:hAnsi="Times New Roman" w:cs="Times New Roman"/>
+          <w:lang w:val="pt-PT"/>
+        </w:rPr>
+        <w:t xml:space="preserve"> frequente do banco de dados e o acompanhamento contínuo do modelo físico, garantindo integridade, escalabilidade e segurança dos dados.</w:t>
       </w:r>
     </w:p>
     <w:sectPr>

</xml_diff>

<commit_message>
Actualizacao da estrutura de tabelas produtos, descontos, impostos precoVenda e das respectivas classes Model e DAO de modo que reflitam a DDL do Banco de dados
</commit_message>
<xml_diff>
--- a/Documentacao_Projeto_JM-InvSM.docx
+++ b/Documentacao_Projeto_JM-InvSM.docx
@@ -188,17 +188,6 @@
           <w:lang w:val="pt-PT"/>
         </w:rPr>
       </w:pPr>
-      <w:r>
-        <w:rPr>
-          <w:rFonts w:ascii="Times New Roman" w:hAnsi="Times New Roman" w:cs="Times New Roman"/>
-          <w:b/>
-          <w:bCs/>
-          <w:sz w:val="36"/>
-          <w:szCs w:val="36"/>
-          <w:lang w:val="pt-PT"/>
-        </w:rPr>
-        <w:t>Fazer código de Emissão de alertas na vendas quando não houver stock suficiente</w:t>
-      </w:r>
       <w:r>
         <w:rPr>
           <w:rFonts w:ascii="Times New Roman" w:hAnsi="Times New Roman" w:cs="Times New Roman"/>
@@ -7794,7 +7783,6 @@
           <w:lang w:val="pt-PT"/>
         </w:rPr>
       </w:pPr>
-      <w:proofErr w:type="spellStart"/>
       <w:r>
         <w:rPr>
           <w:rFonts w:ascii="Times New Roman" w:eastAsiaTheme="majorEastAsia" w:hAnsi="Times New Roman" w:cs="Times New Roman"/>
@@ -7815,9 +7803,8 @@
           <w:szCs w:val="24"/>
           <w:lang w:val="pt-PT"/>
         </w:rPr>
-        <w:t>r_updatePrecoVenda</w:t>
-      </w:r>
-      <w:proofErr w:type="spellEnd"/>
+        <w:t>R_UPDATEPRECOVENDA</w:t>
+      </w:r>
       <w:r>
         <w:rPr>
           <w:rFonts w:ascii="Times New Roman" w:eastAsiaTheme="majorEastAsia" w:hAnsi="Times New Roman" w:cs="Times New Roman"/>

</xml_diff>

<commit_message>
Refactor(metodo listInventario): criacao de agregacao da classe stock com PrecoVenda para permitir armazenamento dos precos de vendas dos produtos por armazem e poder acessar essas informacoes ataves do metodo listInventario da classe StockDAO; correcao das constroller de inventario e de vendas feitas para reflitir as mesmas informacoes de precos de vendas
</commit_message>
<xml_diff>
--- a/Documentacao_Projeto_JM-InvSM.docx
+++ b/Documentacao_Projeto_JM-InvSM.docx
@@ -4045,11 +4045,11 @@
         <w:tblLook w:val="04A0" w:firstRow="1" w:lastRow="0" w:firstColumn="1" w:lastColumn="0" w:noHBand="0" w:noVBand="1"/>
       </w:tblPr>
       <w:tblGrid>
-        <w:gridCol w:w="1961"/>
-        <w:gridCol w:w="1360"/>
-        <w:gridCol w:w="3401"/>
+        <w:gridCol w:w="1955"/>
+        <w:gridCol w:w="1307"/>
+        <w:gridCol w:w="3738"/>
         <w:gridCol w:w="1662"/>
-        <w:gridCol w:w="4566"/>
+        <w:gridCol w:w="4288"/>
       </w:tblGrid>
       <w:tr>
         <w:trPr>
@@ -4058,7 +4058,7 @@
         <w:tc>
           <w:tcPr>
             <w:cnfStyle w:val="001000000100" w:firstRow="0" w:lastRow="0" w:firstColumn="1" w:lastColumn="0" w:oddVBand="0" w:evenVBand="0" w:oddHBand="0" w:evenHBand="0" w:firstRowFirstColumn="1" w:firstRowLastColumn="0" w:lastRowFirstColumn="0" w:lastRowLastColumn="0"/>
-            <w:tcW w:w="1964" w:type="dxa"/>
+            <w:tcW w:w="1961" w:type="dxa"/>
           </w:tcPr>
           <w:p>
             <w:pPr>
@@ -4088,7 +4088,7 @@
         </w:tc>
         <w:tc>
           <w:tcPr>
-            <w:tcW w:w="1384" w:type="dxa"/>
+            <w:tcW w:w="1360" w:type="dxa"/>
           </w:tcPr>
           <w:p>
             <w:pPr>
@@ -4119,7 +4119,7 @@
         </w:tc>
         <w:tc>
           <w:tcPr>
-            <w:tcW w:w="3475" w:type="dxa"/>
+            <w:tcW w:w="3964" w:type="dxa"/>
           </w:tcPr>
           <w:p>
             <w:pPr>
@@ -4150,7 +4150,7 @@
         </w:tc>
         <w:tc>
           <w:tcPr>
-            <w:tcW w:w="1662" w:type="dxa"/>
+            <w:tcW w:w="1099" w:type="dxa"/>
           </w:tcPr>
           <w:p>
             <w:pPr>
@@ -4181,7 +4181,7 @@
         </w:tc>
         <w:tc>
           <w:tcPr>
-            <w:tcW w:w="4691" w:type="dxa"/>
+            <w:tcW w:w="4566" w:type="dxa"/>
           </w:tcPr>
           <w:p>
             <w:pPr>
@@ -4216,7 +4216,7 @@
         <w:tc>
           <w:tcPr>
             <w:cnfStyle w:val="001000000000" w:firstRow="0" w:lastRow="0" w:firstColumn="1" w:lastColumn="0" w:oddVBand="0" w:evenVBand="0" w:oddHBand="0" w:evenHBand="0" w:firstRowFirstColumn="0" w:firstRowLastColumn="0" w:lastRowFirstColumn="0" w:lastRowLastColumn="0"/>
-            <w:tcW w:w="1964" w:type="dxa"/>
+            <w:tcW w:w="1961" w:type="dxa"/>
           </w:tcPr>
           <w:p>
             <w:pPr>
@@ -4240,7 +4240,7 @@
         </w:tc>
         <w:tc>
           <w:tcPr>
-            <w:tcW w:w="1384" w:type="dxa"/>
+            <w:tcW w:w="1360" w:type="dxa"/>
           </w:tcPr>
           <w:p>
             <w:pPr>
@@ -4267,7 +4267,7 @@
         </w:tc>
         <w:tc>
           <w:tcPr>
-            <w:tcW w:w="3475" w:type="dxa"/>
+            <w:tcW w:w="3964" w:type="dxa"/>
           </w:tcPr>
           <w:p>
             <w:pPr>
@@ -4297,7 +4297,7 @@
         </w:tc>
         <w:tc>
           <w:tcPr>
-            <w:tcW w:w="1662" w:type="dxa"/>
+            <w:tcW w:w="1099" w:type="dxa"/>
           </w:tcPr>
           <w:p>
             <w:pPr>
@@ -4324,7 +4324,7 @@
         </w:tc>
         <w:tc>
           <w:tcPr>
-            <w:tcW w:w="4691" w:type="dxa"/>
+            <w:tcW w:w="4566" w:type="dxa"/>
           </w:tcPr>
           <w:p>
             <w:pPr>
@@ -4338,12 +4338,12 @@
                 <w:lang w:val="pt-PT"/>
               </w:rPr>
             </w:pPr>
-            <w:proofErr w:type="spellStart"/>
             <w:r>
               <w:rPr>
                 <w:rFonts w:ascii="Times New Roman" w:hAnsi="Times New Roman" w:cs="Times New Roman"/>
                 <w:sz w:val="20"/>
                 <w:szCs w:val="20"/>
+                <w:lang w:val="pt-PT"/>
               </w:rPr>
               <w:t>Fornece</w:t>
             </w:r>
@@ -4352,89 +4352,18 @@
                 <w:rFonts w:ascii="Times New Roman" w:hAnsi="Times New Roman" w:cs="Times New Roman"/>
                 <w:sz w:val="20"/>
                 <w:szCs w:val="20"/>
+                <w:lang w:val="pt-PT"/>
               </w:rPr>
               <w:t>r</w:t>
             </w:r>
-            <w:proofErr w:type="spellEnd"/>
             <w:r>
               <w:rPr>
                 <w:rFonts w:ascii="Times New Roman" w:hAnsi="Times New Roman" w:cs="Times New Roman"/>
                 <w:sz w:val="20"/>
                 <w:szCs w:val="20"/>
-              </w:rPr>
-              <w:t xml:space="preserve"> </w:t>
-            </w:r>
-            <w:proofErr w:type="spellStart"/>
-            <w:r>
-              <w:rPr>
-                <w:rFonts w:ascii="Times New Roman" w:hAnsi="Times New Roman" w:cs="Times New Roman"/>
-                <w:sz w:val="20"/>
-                <w:szCs w:val="20"/>
-              </w:rPr>
-              <w:t>informações</w:t>
-            </w:r>
-            <w:proofErr w:type="spellEnd"/>
-            <w:r>
-              <w:rPr>
-                <w:rFonts w:ascii="Times New Roman" w:hAnsi="Times New Roman" w:cs="Times New Roman"/>
-                <w:sz w:val="20"/>
-                <w:szCs w:val="20"/>
-              </w:rPr>
-              <w:t xml:space="preserve"> </w:t>
-            </w:r>
-            <w:proofErr w:type="spellStart"/>
-            <w:r>
-              <w:rPr>
-                <w:rFonts w:ascii="Times New Roman" w:hAnsi="Times New Roman" w:cs="Times New Roman"/>
-                <w:sz w:val="20"/>
-                <w:szCs w:val="20"/>
-              </w:rPr>
-              <w:t>sobre</w:t>
-            </w:r>
-            <w:proofErr w:type="spellEnd"/>
-            <w:r>
-              <w:rPr>
-                <w:rFonts w:ascii="Times New Roman" w:hAnsi="Times New Roman" w:cs="Times New Roman"/>
-                <w:sz w:val="20"/>
-                <w:szCs w:val="20"/>
-              </w:rPr>
-              <w:t xml:space="preserve"> </w:t>
-            </w:r>
-            <w:proofErr w:type="spellStart"/>
-            <w:r>
-              <w:rPr>
-                <w:rFonts w:ascii="Times New Roman" w:hAnsi="Times New Roman" w:cs="Times New Roman"/>
-                <w:sz w:val="20"/>
-                <w:szCs w:val="20"/>
-              </w:rPr>
-              <w:t>estrutura</w:t>
-            </w:r>
-            <w:proofErr w:type="spellEnd"/>
-            <w:r>
-              <w:rPr>
-                <w:rFonts w:ascii="Times New Roman" w:hAnsi="Times New Roman" w:cs="Times New Roman"/>
-                <w:sz w:val="20"/>
-                <w:szCs w:val="20"/>
-              </w:rPr>
-              <w:t xml:space="preserve">, </w:t>
-            </w:r>
-            <w:proofErr w:type="spellStart"/>
-            <w:r>
-              <w:rPr>
-                <w:rFonts w:ascii="Times New Roman" w:hAnsi="Times New Roman" w:cs="Times New Roman"/>
-                <w:sz w:val="20"/>
-                <w:szCs w:val="20"/>
-              </w:rPr>
-              <w:t>índices</w:t>
-            </w:r>
-            <w:proofErr w:type="spellEnd"/>
-            <w:r>
-              <w:rPr>
-                <w:rFonts w:ascii="Times New Roman" w:hAnsi="Times New Roman" w:cs="Times New Roman"/>
-                <w:sz w:val="20"/>
-                <w:szCs w:val="20"/>
-              </w:rPr>
-              <w:t xml:space="preserve"> e performance</w:t>
+                <w:lang w:val="pt-PT"/>
+              </w:rPr>
+              <w:t xml:space="preserve"> informações sobre estrutura, índices e performance</w:t>
             </w:r>
           </w:p>
         </w:tc>
@@ -4443,7 +4372,7 @@
         <w:tc>
           <w:tcPr>
             <w:cnfStyle w:val="001000000000" w:firstRow="0" w:lastRow="0" w:firstColumn="1" w:lastColumn="0" w:oddVBand="0" w:evenVBand="0" w:oddHBand="0" w:evenHBand="0" w:firstRowFirstColumn="0" w:firstRowLastColumn="0" w:lastRowFirstColumn="0" w:lastRowLastColumn="0"/>
-            <w:tcW w:w="1964" w:type="dxa"/>
+            <w:tcW w:w="1961" w:type="dxa"/>
           </w:tcPr>
           <w:p>
             <w:pPr>
@@ -4467,7 +4396,7 @@
         </w:tc>
         <w:tc>
           <w:tcPr>
-            <w:tcW w:w="1384" w:type="dxa"/>
+            <w:tcW w:w="1360" w:type="dxa"/>
           </w:tcPr>
           <w:p>
             <w:pPr>
@@ -4494,7 +4423,7 @@
         </w:tc>
         <w:tc>
           <w:tcPr>
-            <w:tcW w:w="3475" w:type="dxa"/>
+            <w:tcW w:w="3964" w:type="dxa"/>
           </w:tcPr>
           <w:p>
             <w:pPr>
@@ -4518,7 +4447,7 @@
         </w:tc>
         <w:tc>
           <w:tcPr>
-            <w:tcW w:w="1662" w:type="dxa"/>
+            <w:tcW w:w="1099" w:type="dxa"/>
           </w:tcPr>
           <w:p>
             <w:pPr>
@@ -4545,7 +4474,7 @@
         </w:tc>
         <w:tc>
           <w:tcPr>
-            <w:tcW w:w="4691" w:type="dxa"/>
+            <w:tcW w:w="4566" w:type="dxa"/>
           </w:tcPr>
           <w:p>
             <w:pPr>
@@ -4569,7 +4498,7 @@
         <w:tc>
           <w:tcPr>
             <w:cnfStyle w:val="001000000000" w:firstRow="0" w:lastRow="0" w:firstColumn="1" w:lastColumn="0" w:oddVBand="0" w:evenVBand="0" w:oddHBand="0" w:evenHBand="0" w:firstRowFirstColumn="0" w:firstRowLastColumn="0" w:lastRowFirstColumn="0" w:lastRowLastColumn="0"/>
-            <w:tcW w:w="1964" w:type="dxa"/>
+            <w:tcW w:w="1961" w:type="dxa"/>
           </w:tcPr>
           <w:p>
             <w:pPr>
@@ -4593,7 +4522,7 @@
         </w:tc>
         <w:tc>
           <w:tcPr>
-            <w:tcW w:w="1384" w:type="dxa"/>
+            <w:tcW w:w="1360" w:type="dxa"/>
           </w:tcPr>
           <w:p>
             <w:pPr>
@@ -4620,7 +4549,7 @@
         </w:tc>
         <w:tc>
           <w:tcPr>
-            <w:tcW w:w="3475" w:type="dxa"/>
+            <w:tcW w:w="3964" w:type="dxa"/>
           </w:tcPr>
           <w:p>
             <w:pPr>
@@ -4644,7 +4573,7 @@
         </w:tc>
         <w:tc>
           <w:tcPr>
-            <w:tcW w:w="1662" w:type="dxa"/>
+            <w:tcW w:w="1099" w:type="dxa"/>
           </w:tcPr>
           <w:p>
             <w:pPr>
@@ -4671,7 +4600,7 @@
         </w:tc>
         <w:tc>
           <w:tcPr>
-            <w:tcW w:w="4691" w:type="dxa"/>
+            <w:tcW w:w="4566" w:type="dxa"/>
           </w:tcPr>
           <w:p>
             <w:pPr>
@@ -4692,7 +4621,7 @@
         <w:tc>
           <w:tcPr>
             <w:cnfStyle w:val="001000000000" w:firstRow="0" w:lastRow="0" w:firstColumn="1" w:lastColumn="0" w:oddVBand="0" w:evenVBand="0" w:oddHBand="0" w:evenHBand="0" w:firstRowFirstColumn="0" w:firstRowLastColumn="0" w:lastRowFirstColumn="0" w:lastRowLastColumn="0"/>
-            <w:tcW w:w="1964" w:type="dxa"/>
+            <w:tcW w:w="1961" w:type="dxa"/>
           </w:tcPr>
           <w:p>
             <w:pPr>
@@ -4718,7 +4647,7 @@
         </w:tc>
         <w:tc>
           <w:tcPr>
-            <w:tcW w:w="1384" w:type="dxa"/>
+            <w:tcW w:w="1360" w:type="dxa"/>
           </w:tcPr>
           <w:p>
             <w:pPr>
@@ -4736,7 +4665,7 @@
         </w:tc>
         <w:tc>
           <w:tcPr>
-            <w:tcW w:w="3475" w:type="dxa"/>
+            <w:tcW w:w="3964" w:type="dxa"/>
           </w:tcPr>
           <w:p>
             <w:pPr>
@@ -4750,7 +4679,7 @@
         </w:tc>
         <w:tc>
           <w:tcPr>
-            <w:tcW w:w="1662" w:type="dxa"/>
+            <w:tcW w:w="1099" w:type="dxa"/>
           </w:tcPr>
           <w:p>
             <w:pPr>
@@ -4768,7 +4697,7 @@
         </w:tc>
         <w:tc>
           <w:tcPr>
-            <w:tcW w:w="4691" w:type="dxa"/>
+            <w:tcW w:w="4566" w:type="dxa"/>
           </w:tcPr>
           <w:p>
             <w:pPr>
@@ -4782,70 +4711,15 @@
                 <w:lang w:val="pt-PT"/>
               </w:rPr>
             </w:pPr>
-            <w:proofErr w:type="spellStart"/>
             <w:r>
               <w:rPr>
                 <w:rFonts w:ascii="Times New Roman" w:hAnsi="Times New Roman" w:cs="Times New Roman"/>
                 <w:sz w:val="20"/>
                 <w:szCs w:val="20"/>
-              </w:rPr>
-              <w:t>Explica</w:t>
-            </w:r>
-            <w:proofErr w:type="spellEnd"/>
-            <w:r>
-              <w:rPr>
-                <w:rFonts w:ascii="Times New Roman" w:hAnsi="Times New Roman" w:cs="Times New Roman"/>
-                <w:sz w:val="20"/>
-                <w:szCs w:val="20"/>
-              </w:rPr>
-              <w:t xml:space="preserve"> </w:t>
-            </w:r>
-            <w:proofErr w:type="spellStart"/>
-            <w:r>
-              <w:rPr>
-                <w:rFonts w:ascii="Times New Roman" w:hAnsi="Times New Roman" w:cs="Times New Roman"/>
-                <w:sz w:val="20"/>
-                <w:szCs w:val="20"/>
-              </w:rPr>
-              <w:t>relatórios</w:t>
-            </w:r>
-            <w:proofErr w:type="spellEnd"/>
-            <w:r>
-              <w:rPr>
-                <w:rFonts w:ascii="Times New Roman" w:hAnsi="Times New Roman" w:cs="Times New Roman"/>
-                <w:sz w:val="20"/>
-                <w:szCs w:val="20"/>
-              </w:rPr>
-              <w:t xml:space="preserve"> e </w:t>
-            </w:r>
-            <w:proofErr w:type="spellStart"/>
-            <w:r>
-              <w:rPr>
-                <w:rFonts w:ascii="Times New Roman" w:hAnsi="Times New Roman" w:cs="Times New Roman"/>
-                <w:sz w:val="20"/>
-                <w:szCs w:val="20"/>
-              </w:rPr>
-              <w:t>interpreta</w:t>
-            </w:r>
-            <w:proofErr w:type="spellEnd"/>
-            <w:r>
-              <w:rPr>
-                <w:rFonts w:ascii="Times New Roman" w:hAnsi="Times New Roman" w:cs="Times New Roman"/>
-                <w:sz w:val="20"/>
-                <w:szCs w:val="20"/>
-              </w:rPr>
-              <w:t xml:space="preserve"> dados de </w:t>
-            </w:r>
-            <w:proofErr w:type="spellStart"/>
-            <w:r>
-              <w:rPr>
-                <w:rFonts w:ascii="Times New Roman" w:hAnsi="Times New Roman" w:cs="Times New Roman"/>
-                <w:sz w:val="20"/>
-                <w:szCs w:val="20"/>
-              </w:rPr>
-              <w:t>faturas</w:t>
-            </w:r>
-            <w:proofErr w:type="spellEnd"/>
+                <w:lang w:val="pt-PT"/>
+              </w:rPr>
+              <w:t>Explica relatórios e interpreta dados de faturas</w:t>
+            </w:r>
           </w:p>
         </w:tc>
       </w:tr>
@@ -4856,7 +4730,7 @@
         <w:tc>
           <w:tcPr>
             <w:cnfStyle w:val="001000000000" w:firstRow="0" w:lastRow="0" w:firstColumn="1" w:lastColumn="0" w:oddVBand="0" w:evenVBand="0" w:oddHBand="0" w:evenHBand="0" w:firstRowFirstColumn="0" w:firstRowLastColumn="0" w:lastRowFirstColumn="0" w:lastRowLastColumn="0"/>
-            <w:tcW w:w="1964" w:type="dxa"/>
+            <w:tcW w:w="1961" w:type="dxa"/>
           </w:tcPr>
           <w:p>
             <w:pPr>
@@ -4882,7 +4756,7 @@
         </w:tc>
         <w:tc>
           <w:tcPr>
-            <w:tcW w:w="1384" w:type="dxa"/>
+            <w:tcW w:w="1360" w:type="dxa"/>
           </w:tcPr>
           <w:p>
             <w:pPr>
@@ -4900,7 +4774,7 @@
         </w:tc>
         <w:tc>
           <w:tcPr>
-            <w:tcW w:w="3475" w:type="dxa"/>
+            <w:tcW w:w="3964" w:type="dxa"/>
           </w:tcPr>
           <w:p>
             <w:pPr>
@@ -4914,7 +4788,7 @@
         </w:tc>
         <w:tc>
           <w:tcPr>
-            <w:tcW w:w="1662" w:type="dxa"/>
+            <w:tcW w:w="1099" w:type="dxa"/>
           </w:tcPr>
           <w:p>
             <w:pPr>
@@ -4932,7 +4806,7 @@
         </w:tc>
         <w:tc>
           <w:tcPr>
-            <w:tcW w:w="4691" w:type="dxa"/>
+            <w:tcW w:w="4566" w:type="dxa"/>
           </w:tcPr>
           <w:p>
             <w:pPr>
@@ -4951,55 +4825,10 @@
                 <w:rFonts w:ascii="Times New Roman" w:hAnsi="Times New Roman" w:cs="Times New Roman"/>
                 <w:sz w:val="20"/>
                 <w:szCs w:val="20"/>
-              </w:rPr>
-              <w:t xml:space="preserve">Informa </w:t>
-            </w:r>
-            <w:proofErr w:type="spellStart"/>
-            <w:r>
-              <w:rPr>
-                <w:rFonts w:ascii="Times New Roman" w:hAnsi="Times New Roman" w:cs="Times New Roman"/>
-                <w:sz w:val="20"/>
-                <w:szCs w:val="20"/>
-              </w:rPr>
-              <w:t>origem</w:t>
-            </w:r>
-            <w:proofErr w:type="spellEnd"/>
-            <w:r>
-              <w:rPr>
-                <w:rFonts w:ascii="Times New Roman" w:hAnsi="Times New Roman" w:cs="Times New Roman"/>
-                <w:sz w:val="20"/>
-                <w:szCs w:val="20"/>
-              </w:rPr>
-              <w:t xml:space="preserve"> e </w:t>
-            </w:r>
-            <w:proofErr w:type="spellStart"/>
-            <w:r>
-              <w:rPr>
-                <w:rFonts w:ascii="Times New Roman" w:hAnsi="Times New Roman" w:cs="Times New Roman"/>
-                <w:sz w:val="20"/>
-                <w:szCs w:val="20"/>
-              </w:rPr>
-              <w:t>movimentação</w:t>
-            </w:r>
-            <w:proofErr w:type="spellEnd"/>
-            <w:r>
-              <w:rPr>
-                <w:rFonts w:ascii="Times New Roman" w:hAnsi="Times New Roman" w:cs="Times New Roman"/>
-                <w:sz w:val="20"/>
-                <w:szCs w:val="20"/>
-              </w:rPr>
-              <w:t xml:space="preserve"> de </w:t>
-            </w:r>
-            <w:proofErr w:type="spellStart"/>
-            <w:r>
-              <w:rPr>
-                <w:rFonts w:ascii="Times New Roman" w:hAnsi="Times New Roman" w:cs="Times New Roman"/>
-                <w:sz w:val="20"/>
-                <w:szCs w:val="20"/>
-              </w:rPr>
-              <w:t>produtos</w:t>
-            </w:r>
-            <w:proofErr w:type="spellEnd"/>
+                <w:lang w:val="pt-PT"/>
+              </w:rPr>
+              <w:t>Informa origem e movimentação de produtos</w:t>
+            </w:r>
           </w:p>
         </w:tc>
       </w:tr>
@@ -5007,7 +4836,7 @@
         <w:tc>
           <w:tcPr>
             <w:cnfStyle w:val="001000000000" w:firstRow="0" w:lastRow="0" w:firstColumn="1" w:lastColumn="0" w:oddVBand="0" w:evenVBand="0" w:oddHBand="0" w:evenHBand="0" w:firstRowFirstColumn="0" w:firstRowLastColumn="0" w:lastRowFirstColumn="0" w:lastRowLastColumn="0"/>
-            <w:tcW w:w="1964" w:type="dxa"/>
+            <w:tcW w:w="1961" w:type="dxa"/>
           </w:tcPr>
           <w:p>
             <w:pPr>
@@ -5033,7 +4862,7 @@
         </w:tc>
         <w:tc>
           <w:tcPr>
-            <w:tcW w:w="1384" w:type="dxa"/>
+            <w:tcW w:w="1360" w:type="dxa"/>
           </w:tcPr>
           <w:p>
             <w:pPr>
@@ -5051,7 +4880,7 @@
         </w:tc>
         <w:tc>
           <w:tcPr>
-            <w:tcW w:w="3475" w:type="dxa"/>
+            <w:tcW w:w="3964" w:type="dxa"/>
           </w:tcPr>
           <w:p>
             <w:pPr>
@@ -5065,7 +4894,7 @@
         </w:tc>
         <w:tc>
           <w:tcPr>
-            <w:tcW w:w="1662" w:type="dxa"/>
+            <w:tcW w:w="1099" w:type="dxa"/>
           </w:tcPr>
           <w:p>
             <w:pPr>
@@ -5083,7 +4912,7 @@
         </w:tc>
         <w:tc>
           <w:tcPr>
-            <w:tcW w:w="4691" w:type="dxa"/>
+            <w:tcW w:w="4566" w:type="dxa"/>
           </w:tcPr>
           <w:p>
             <w:pPr>
@@ -5097,70 +4926,15 @@
                 <w:lang w:val="pt-PT"/>
               </w:rPr>
             </w:pPr>
-            <w:proofErr w:type="spellStart"/>
             <w:r>
               <w:rPr>
                 <w:rFonts w:ascii="Times New Roman" w:hAnsi="Times New Roman" w:cs="Times New Roman"/>
                 <w:sz w:val="20"/>
                 <w:szCs w:val="20"/>
-              </w:rPr>
-              <w:t>Explica</w:t>
-            </w:r>
-            <w:proofErr w:type="spellEnd"/>
-            <w:r>
-              <w:rPr>
-                <w:rFonts w:ascii="Times New Roman" w:hAnsi="Times New Roman" w:cs="Times New Roman"/>
-                <w:sz w:val="20"/>
-                <w:szCs w:val="20"/>
-              </w:rPr>
-              <w:t xml:space="preserve"> </w:t>
-            </w:r>
-            <w:proofErr w:type="spellStart"/>
-            <w:r>
-              <w:rPr>
-                <w:rFonts w:ascii="Times New Roman" w:hAnsi="Times New Roman" w:cs="Times New Roman"/>
-                <w:sz w:val="20"/>
-                <w:szCs w:val="20"/>
-              </w:rPr>
-              <w:t>lançamentos</w:t>
-            </w:r>
-            <w:proofErr w:type="spellEnd"/>
-            <w:r>
-              <w:rPr>
-                <w:rFonts w:ascii="Times New Roman" w:hAnsi="Times New Roman" w:cs="Times New Roman"/>
-                <w:sz w:val="20"/>
-                <w:szCs w:val="20"/>
-              </w:rPr>
-              <w:t xml:space="preserve"> </w:t>
-            </w:r>
-            <w:proofErr w:type="spellStart"/>
-            <w:r>
-              <w:rPr>
-                <w:rFonts w:ascii="Times New Roman" w:hAnsi="Times New Roman" w:cs="Times New Roman"/>
-                <w:sz w:val="20"/>
-                <w:szCs w:val="20"/>
-              </w:rPr>
-              <w:t>financeiros</w:t>
-            </w:r>
-            <w:proofErr w:type="spellEnd"/>
-            <w:r>
-              <w:rPr>
-                <w:rFonts w:ascii="Times New Roman" w:hAnsi="Times New Roman" w:cs="Times New Roman"/>
-                <w:sz w:val="20"/>
-                <w:szCs w:val="20"/>
-              </w:rPr>
-              <w:t xml:space="preserve"> e </w:t>
-            </w:r>
-            <w:proofErr w:type="spellStart"/>
-            <w:r>
-              <w:rPr>
-                <w:rFonts w:ascii="Times New Roman" w:hAnsi="Times New Roman" w:cs="Times New Roman"/>
-                <w:sz w:val="20"/>
-                <w:szCs w:val="20"/>
-              </w:rPr>
-              <w:t>reconciliação</w:t>
-            </w:r>
-            <w:proofErr w:type="spellEnd"/>
+                <w:lang w:val="pt-PT"/>
+              </w:rPr>
+              <w:t>Explica lançamentos financeiros e reconciliação</w:t>
+            </w:r>
           </w:p>
         </w:tc>
       </w:tr>

</xml_diff>